<commit_message>
Keep report source section to raw code only
</commit_message>
<xml_diff>
--- a/report/BDA_Movie_Recommendation_Report.docx
+++ b/report/BDA_Movie_Recommendation_Report.docx
@@ -7920,21 +7920,7 @@
           <w:color w:val="000000"/>
           <w:b/>
         </w:rPr>
-        <w:t>9 Selected Source Code</w:t>
-      </w:r>
-    </w:p>
-    <w:p xmlns:w="http://schemas.openxmlformats.org/wordprocessingml/2006/main" xmlns:wpc="http://schemas.microsoft.com/office/word/2010/wordprocessingCanvas" xmlns:mo="http://schemas.microsoft.com/office/mac/office/2008/main" xmlns:mc="http://schemas.openxmlformats.org/markup-compatibility/2006" xmlns:mv="urn:schemas-microsoft-com:mac:vml" xmlns:o="urn:schemas-microsoft-com:office:office" xmlns:r="http://schemas.openxmlformats.org/officeDocument/2006/relationships" xmlns:m="http://schemas.openxmlformats.org/officeDocument/2006/math" xmlns:v="urn:schemas-microsoft-com:vml" xmlns:wp14="http://schemas.microsoft.com/office/word/2010/wordprocessingDrawing" xmlns:wp="http://schemas.openxmlformats.org/drawingml/2006/wordprocessingDrawing" xmlns:w10="urn:schemas-microsoft-com:office:word" xmlns:w14="http://schemas.microsoft.com/office/word/2010/wordml" xmlns:wpg="http://schemas.microsoft.com/office/word/2010/wordprocessingGroup" xmlns:wpi="http://schemas.microsoft.com/office/word/2010/wordprocessingInk" xmlns:wne="http://schemas.microsoft.com/office/word/2006/wordml" xmlns:wps="http://schemas.microsoft.com/office/word/2010/wordprocessingShape">
-      <w:pPr>
-        <w:spacing w:after="100"/>
-      </w:pPr>
-      <w:r>
-        <w:rPr>
-          <w:rFonts w:ascii="Times New Roman" w:hAnsi="Times New Roman"/>
-          <w:b/>
-          <w:sz w:val="24"/>
-          <w:color w:val="000000"/>
-        </w:rPr>
-        <w:t>Main ALS training and error calculation</w:t>
+        <w:t>9 Source Code</w:t>
       </w:r>
     </w:p>
     <w:p xmlns:w="http://schemas.openxmlformats.org/wordprocessingml/2006/main" xmlns:wpc="http://schemas.microsoft.com/office/word/2010/wordprocessingCanvas" xmlns:mo="http://schemas.microsoft.com/office/mac/office/2008/main" xmlns:mc="http://schemas.openxmlformats.org/markup-compatibility/2006" xmlns:mv="urn:schemas-microsoft-com:mac:vml" xmlns:o="urn:schemas-microsoft-com:office:office" xmlns:r="http://schemas.openxmlformats.org/officeDocument/2006/relationships" xmlns:m="http://schemas.openxmlformats.org/officeDocument/2006/math" xmlns:v="urn:schemas-microsoft-com:vml" xmlns:wp14="http://schemas.microsoft.com/office/word/2010/wordprocessingDrawing" xmlns:wp="http://schemas.openxmlformats.org/drawingml/2006/wordprocessingDrawing" xmlns:w10="urn:schemas-microsoft-com:office:word" xmlns:w14="http://schemas.microsoft.com/office/word/2010/wordml" xmlns:wpg="http://schemas.microsoft.com/office/word/2010/wordprocessingGroup" xmlns:wpi="http://schemas.microsoft.com/office/word/2010/wordprocessingInk" xmlns:wne="http://schemas.microsoft.com/office/word/2006/wordml" xmlns:wps="http://schemas.microsoft.com/office/word/2010/wordprocessingShape">
@@ -8163,22 +8149,6 @@
     </w:p>
     <w:p xmlns:w="http://schemas.openxmlformats.org/wordprocessingml/2006/main" xmlns:wpc="http://schemas.microsoft.com/office/word/2010/wordprocessingCanvas" xmlns:mo="http://schemas.microsoft.com/office/mac/office/2008/main" xmlns:mc="http://schemas.openxmlformats.org/markup-compatibility/2006" xmlns:mv="urn:schemas-microsoft-com:mac:vml" xmlns:o="urn:schemas-microsoft-com:office:office" xmlns:r="http://schemas.openxmlformats.org/officeDocument/2006/relationships" xmlns:m="http://schemas.openxmlformats.org/officeDocument/2006/math" xmlns:v="urn:schemas-microsoft-com:vml" xmlns:wp14="http://schemas.microsoft.com/office/word/2010/wordprocessingDrawing" xmlns:wp="http://schemas.openxmlformats.org/drawingml/2006/wordprocessingDrawing" xmlns:w10="urn:schemas-microsoft-com:office:word" xmlns:w14="http://schemas.microsoft.com/office/word/2010/wordml" xmlns:wpg="http://schemas.microsoft.com/office/word/2010/wordprocessingGroup" xmlns:wpi="http://schemas.microsoft.com/office/word/2010/wordprocessingInk" xmlns:wne="http://schemas.microsoft.com/office/word/2006/wordml" xmlns:wps="http://schemas.microsoft.com/office/word/2010/wordprocessingShape">
       <w:pPr>
-        <w:keepNext/>
-        <w:pageBreakBefore w:val="0"/>
-        <w:spacing w:before="120" w:after="80"/>
-      </w:pPr>
-      <w:r>
-        <w:rPr>
-          <w:rFonts w:ascii="Times New Roman" w:hAnsi="Times New Roman"/>
-          <w:sz w:val="32"/>
-          <w:color w:val="000000"/>
-          <w:b/>
-        </w:rPr>
-        <w:t>9.1 New User Calculation</w:t>
-      </w:r>
-    </w:p>
-    <w:p xmlns:w="http://schemas.openxmlformats.org/wordprocessingml/2006/main" xmlns:wpc="http://schemas.microsoft.com/office/word/2010/wordprocessingCanvas" xmlns:mo="http://schemas.microsoft.com/office/mac/office/2008/main" xmlns:mc="http://schemas.openxmlformats.org/markup-compatibility/2006" xmlns:mv="urn:schemas-microsoft-com:mac:vml" xmlns:o="urn:schemas-microsoft-com:office:office" xmlns:r="http://schemas.openxmlformats.org/officeDocument/2006/relationships" xmlns:m="http://schemas.openxmlformats.org/officeDocument/2006/math" xmlns:v="urn:schemas-microsoft-com:vml" xmlns:wp14="http://schemas.microsoft.com/office/word/2010/wordprocessingDrawing" xmlns:wp="http://schemas.openxmlformats.org/drawingml/2006/wordprocessingDrawing" xmlns:w10="urn:schemas-microsoft-com:office:word" xmlns:w14="http://schemas.microsoft.com/office/word/2010/wordml" xmlns:wpg="http://schemas.microsoft.com/office/word/2010/wordprocessingGroup" xmlns:wpi="http://schemas.microsoft.com/office/word/2010/wordprocessingInk" xmlns:wne="http://schemas.microsoft.com/office/word/2006/wordml" xmlns:wps="http://schemas.microsoft.com/office/word/2010/wordprocessingShape">
-      <w:pPr>
         <w:keepLines/>
         <w:spacing w:after="0" w:line="230" w:lineRule="exact"/>
       </w:pPr>
@@ -8188,7 +8158,7 @@
           <w:sz w:val="20"/>
           <w:color w:val="000000"/>
         </w:rPr>
-        <w:t>double[] fitProfile(List&lt;Rating&gt; ratings) {</w:t>
+        <w:t xml:space="preserve"> </w:t>
       </w:r>
     </w:p>
     <w:p xmlns:w="http://schemas.openxmlformats.org/wordprocessingml/2006/main" xmlns:wpc="http://schemas.microsoft.com/office/word/2010/wordprocessingCanvas" xmlns:mo="http://schemas.microsoft.com/office/mac/office/2008/main" xmlns:mc="http://schemas.openxmlformats.org/markup-compatibility/2006" xmlns:mv="urn:schemas-microsoft-com:mac:vml" xmlns:o="urn:schemas-microsoft-com:office:office" xmlns:r="http://schemas.openxmlformats.org/officeDocument/2006/relationships" xmlns:m="http://schemas.openxmlformats.org/officeDocument/2006/math" xmlns:v="urn:schemas-microsoft-com:vml" xmlns:wp14="http://schemas.microsoft.com/office/word/2010/wordprocessingDrawing" xmlns:wp="http://schemas.openxmlformats.org/drawingml/2006/wordprocessingDrawing" xmlns:w10="urn:schemas-microsoft-com:office:word" xmlns:w14="http://schemas.microsoft.com/office/word/2010/wordml" xmlns:wpg="http://schemas.microsoft.com/office/word/2010/wordprocessingGroup" xmlns:wpi="http://schemas.microsoft.com/office/word/2010/wordprocessingInk" xmlns:wne="http://schemas.microsoft.com/office/word/2006/wordml" xmlns:wps="http://schemas.microsoft.com/office/word/2010/wordprocessingShape">
@@ -8202,7 +8172,7 @@
           <w:sz w:val="20"/>
           <w:color w:val="000000"/>
         </w:rPr>
-        <w:t xml:space="preserve">    int k = model.rank;</w:t>
+        <w:t>public List&lt;Recommendation&gt; forUser(int id, int limit,</w:t>
       </w:r>
     </w:p>
     <w:p xmlns:w="http://schemas.openxmlformats.org/wordprocessingml/2006/main" xmlns:wpc="http://schemas.microsoft.com/office/word/2010/wordprocessingCanvas" xmlns:mo="http://schemas.microsoft.com/office/mac/office/2008/main" xmlns:mc="http://schemas.openxmlformats.org/markup-compatibility/2006" xmlns:mv="urn:schemas-microsoft-com:mac:vml" xmlns:o="urn:schemas-microsoft-com:office:office" xmlns:r="http://schemas.openxmlformats.org/officeDocument/2006/relationships" xmlns:m="http://schemas.openxmlformats.org/officeDocument/2006/math" xmlns:v="urn:schemas-microsoft-com:vml" xmlns:wp14="http://schemas.microsoft.com/office/word/2010/wordprocessingDrawing" xmlns:wp="http://schemas.openxmlformats.org/drawingml/2006/wordprocessingDrawing" xmlns:w10="urn:schemas-microsoft-com:office:word" xmlns:w14="http://schemas.microsoft.com/office/word/2010/wordml" xmlns:wpg="http://schemas.microsoft.com/office/word/2010/wordprocessingGroup" xmlns:wpi="http://schemas.microsoft.com/office/word/2010/wordprocessingInk" xmlns:wne="http://schemas.microsoft.com/office/word/2006/wordml" xmlns:wps="http://schemas.microsoft.com/office/word/2010/wordprocessingShape">
@@ -8216,7 +8186,7 @@
           <w:sz w:val="20"/>
           <w:color w:val="000000"/>
         </w:rPr>
-        <w:t xml:space="preserve">    double[][] gram = new double[k][k];</w:t>
+        <w:t xml:space="preserve">        String genre, int minimumRatings) {</w:t>
       </w:r>
     </w:p>
     <w:p xmlns:w="http://schemas.openxmlformats.org/wordprocessingml/2006/main" xmlns:wpc="http://schemas.microsoft.com/office/word/2010/wordprocessingCanvas" xmlns:mo="http://schemas.microsoft.com/office/mac/office/2008/main" xmlns:mc="http://schemas.openxmlformats.org/markup-compatibility/2006" xmlns:mv="urn:schemas-microsoft-com:mac:vml" xmlns:o="urn:schemas-microsoft-com:office:office" xmlns:r="http://schemas.openxmlformats.org/officeDocument/2006/relationships" xmlns:m="http://schemas.openxmlformats.org/officeDocument/2006/math" xmlns:v="urn:schemas-microsoft-com:vml" xmlns:wp14="http://schemas.microsoft.com/office/word/2010/wordprocessingDrawing" xmlns:wp="http://schemas.openxmlformats.org/drawingml/2006/wordprocessingDrawing" xmlns:w10="urn:schemas-microsoft-com:office:word" xmlns:w14="http://schemas.microsoft.com/office/word/2010/wordml" xmlns:wpg="http://schemas.microsoft.com/office/word/2010/wordprocessingGroup" xmlns:wpi="http://schemas.microsoft.com/office/word/2010/wordprocessingInk" xmlns:wne="http://schemas.microsoft.com/office/word/2006/wordml" xmlns:wps="http://schemas.microsoft.com/office/word/2010/wordprocessingShape">
@@ -8230,7 +8200,7 @@
           <w:sz w:val="20"/>
           <w:color w:val="000000"/>
         </w:rPr>
-        <w:t xml:space="preserve">    double[] rhs = new double[k];</w:t>
+        <w:t xml:space="preserve">    Set&lt;Integer&gt; seen = new HashSet&lt;&gt;();</w:t>
       </w:r>
     </w:p>
     <w:p xmlns:w="http://schemas.openxmlformats.org/wordprocessingml/2006/main" xmlns:wpc="http://schemas.microsoft.com/office/word/2010/wordprocessingCanvas" xmlns:mo="http://schemas.microsoft.com/office/mac/office/2008/main" xmlns:mc="http://schemas.openxmlformats.org/markup-compatibility/2006" xmlns:mv="urn:schemas-microsoft-com:mac:vml" xmlns:o="urn:schemas-microsoft-com:office:office" xmlns:r="http://schemas.openxmlformats.org/officeDocument/2006/relationships" xmlns:m="http://schemas.openxmlformats.org/officeDocument/2006/math" xmlns:v="urn:schemas-microsoft-com:vml" xmlns:wp14="http://schemas.microsoft.com/office/word/2010/wordprocessingDrawing" xmlns:wp="http://schemas.openxmlformats.org/drawingml/2006/wordprocessingDrawing" xmlns:w10="urn:schemas-microsoft-com:office:word" xmlns:w14="http://schemas.microsoft.com/office/word/2010/wordml" xmlns:wpg="http://schemas.microsoft.com/office/word/2010/wordprocessingGroup" xmlns:wpi="http://schemas.microsoft.com/office/word/2010/wordprocessingInk" xmlns:wne="http://schemas.microsoft.com/office/word/2006/wordml" xmlns:wps="http://schemas.microsoft.com/office/word/2010/wordprocessingShape">
@@ -8244,7 +8214,7 @@
           <w:sz w:val="20"/>
           <w:color w:val="000000"/>
         </w:rPr>
-        <w:t xml:space="preserve">    for (Rating r : ratings) {</w:t>
+        <w:t xml:space="preserve">    for (Rating r : model.histories.getOrDefault(id, List.of()))</w:t>
       </w:r>
     </w:p>
     <w:p xmlns:w="http://schemas.openxmlformats.org/wordprocessingml/2006/main" xmlns:wpc="http://schemas.microsoft.com/office/word/2010/wordprocessingCanvas" xmlns:mo="http://schemas.microsoft.com/office/mac/office/2008/main" xmlns:mc="http://schemas.openxmlformats.org/markup-compatibility/2006" xmlns:mv="urn:schemas-microsoft-com:mac:vml" xmlns:o="urn:schemas-microsoft-com:office:office" xmlns:r="http://schemas.openxmlformats.org/officeDocument/2006/relationships" xmlns:m="http://schemas.openxmlformats.org/officeDocument/2006/math" xmlns:v="urn:schemas-microsoft-com:vml" xmlns:wp14="http://schemas.microsoft.com/office/word/2010/wordprocessingDrawing" xmlns:wp="http://schemas.openxmlformats.org/drawingml/2006/wordprocessingDrawing" xmlns:w10="urn:schemas-microsoft-com:office:word" xmlns:w14="http://schemas.microsoft.com/office/word/2010/wordml" xmlns:wpg="http://schemas.microsoft.com/office/word/2010/wordprocessingGroup" xmlns:wpi="http://schemas.microsoft.com/office/word/2010/wordprocessingInk" xmlns:wne="http://schemas.microsoft.com/office/word/2006/wordml" xmlns:wps="http://schemas.microsoft.com/office/word/2010/wordprocessingShape">
@@ -8258,7 +8228,7 @@
           <w:sz w:val="20"/>
           <w:color w:val="000000"/>
         </w:rPr>
-        <w:t xml:space="preserve">        double[] y = model.items.get(r.movieId());</w:t>
+        <w:t xml:space="preserve">        seen.add(r.movieId());</w:t>
       </w:r>
     </w:p>
     <w:p xmlns:w="http://schemas.openxmlformats.org/wordprocessingml/2006/main" xmlns:wpc="http://schemas.microsoft.com/office/word/2010/wordprocessingCanvas" xmlns:mo="http://schemas.microsoft.com/office/mac/office/2008/main" xmlns:mc="http://schemas.openxmlformats.org/markup-compatibility/2006" xmlns:mv="urn:schemas-microsoft-com:mac:vml" xmlns:o="urn:schemas-microsoft-com:office:office" xmlns:r="http://schemas.openxmlformats.org/officeDocument/2006/relationships" xmlns:m="http://schemas.openxmlformats.org/officeDocument/2006/math" xmlns:v="urn:schemas-microsoft-com:vml" xmlns:wp14="http://schemas.microsoft.com/office/word/2010/wordprocessingDrawing" xmlns:wp="http://schemas.openxmlformats.org/drawingml/2006/wordprocessingDrawing" xmlns:w10="urn:schemas-microsoft-com:office:word" xmlns:w14="http://schemas.microsoft.com/office/word/2010/wordml" xmlns:wpg="http://schemas.microsoft.com/office/word/2010/wordprocessingGroup" xmlns:wpi="http://schemas.microsoft.com/office/word/2010/wordprocessingInk" xmlns:wne="http://schemas.microsoft.com/office/word/2006/wordml" xmlns:wps="http://schemas.microsoft.com/office/word/2010/wordprocessingShape">
@@ -8272,7 +8242,7 @@
           <w:sz w:val="20"/>
           <w:color w:val="000000"/>
         </w:rPr>
-        <w:t xml:space="preserve">        for (int i = 0; i &lt; k; i++) {</w:t>
+        <w:t xml:space="preserve">    return rank(model.users.get(id), seen, limit,</w:t>
       </w:r>
     </w:p>
     <w:p xmlns:w="http://schemas.openxmlformats.org/wordprocessingml/2006/main" xmlns:wpc="http://schemas.microsoft.com/office/word/2010/wordprocessingCanvas" xmlns:mo="http://schemas.microsoft.com/office/mac/office/2008/main" xmlns:mc="http://schemas.openxmlformats.org/markup-compatibility/2006" xmlns:mv="urn:schemas-microsoft-com:mac:vml" xmlns:o="urn:schemas-microsoft-com:office:office" xmlns:r="http://schemas.openxmlformats.org/officeDocument/2006/relationships" xmlns:m="http://schemas.openxmlformats.org/officeDocument/2006/math" xmlns:v="urn:schemas-microsoft-com:vml" xmlns:wp14="http://schemas.microsoft.com/office/word/2010/wordprocessingDrawing" xmlns:wp="http://schemas.openxmlformats.org/drawingml/2006/wordprocessingDrawing" xmlns:w10="urn:schemas-microsoft-com:office:word" xmlns:w14="http://schemas.microsoft.com/office/word/2010/wordml" xmlns:wpg="http://schemas.microsoft.com/office/word/2010/wordprocessingGroup" xmlns:wpi="http://schemas.microsoft.com/office/word/2010/wordprocessingInk" xmlns:wne="http://schemas.microsoft.com/office/word/2006/wordml" xmlns:wps="http://schemas.microsoft.com/office/word/2010/wordprocessingShape">
@@ -8286,7 +8256,7 @@
           <w:sz w:val="20"/>
           <w:color w:val="000000"/>
         </w:rPr>
-        <w:t xml:space="preserve">            rhs[i] += y[i] * r.rating();</w:t>
+        <w:t xml:space="preserve">                genre, minimumRatings);</w:t>
       </w:r>
     </w:p>
     <w:p xmlns:w="http://schemas.openxmlformats.org/wordprocessingml/2006/main" xmlns:wpc="http://schemas.microsoft.com/office/word/2010/wordprocessingCanvas" xmlns:mo="http://schemas.microsoft.com/office/mac/office/2008/main" xmlns:mc="http://schemas.openxmlformats.org/markup-compatibility/2006" xmlns:mv="urn:schemas-microsoft-com:mac:vml" xmlns:o="urn:schemas-microsoft-com:office:office" xmlns:r="http://schemas.openxmlformats.org/officeDocument/2006/relationships" xmlns:m="http://schemas.openxmlformats.org/officeDocument/2006/math" xmlns:v="urn:schemas-microsoft-com:vml" xmlns:wp14="http://schemas.microsoft.com/office/word/2010/wordprocessingDrawing" xmlns:wp="http://schemas.openxmlformats.org/drawingml/2006/wordprocessingDrawing" xmlns:w10="urn:schemas-microsoft-com:office:word" xmlns:w14="http://schemas.microsoft.com/office/word/2010/wordml" xmlns:wpg="http://schemas.microsoft.com/office/word/2010/wordprocessingGroup" xmlns:wpi="http://schemas.microsoft.com/office/word/2010/wordprocessingInk" xmlns:wne="http://schemas.microsoft.com/office/word/2006/wordml" xmlns:wps="http://schemas.microsoft.com/office/word/2010/wordprocessingShape">
@@ -8300,7 +8270,7 @@
           <w:sz w:val="20"/>
           <w:color w:val="000000"/>
         </w:rPr>
-        <w:t xml:space="preserve">            for (int j = 0; j &lt; k; j++)</w:t>
+        <w:t>}</w:t>
       </w:r>
     </w:p>
     <w:p xmlns:w="http://schemas.openxmlformats.org/wordprocessingml/2006/main" xmlns:wpc="http://schemas.microsoft.com/office/word/2010/wordprocessingCanvas" xmlns:mo="http://schemas.microsoft.com/office/mac/office/2008/main" xmlns:mc="http://schemas.openxmlformats.org/markup-compatibility/2006" xmlns:mv="urn:schemas-microsoft-com:mac:vml" xmlns:o="urn:schemas-microsoft-com:office:office" xmlns:r="http://schemas.openxmlformats.org/officeDocument/2006/relationships" xmlns:m="http://schemas.openxmlformats.org/officeDocument/2006/math" xmlns:v="urn:schemas-microsoft-com:vml" xmlns:wp14="http://schemas.microsoft.com/office/word/2010/wordprocessingDrawing" xmlns:wp="http://schemas.openxmlformats.org/drawingml/2006/wordprocessingDrawing" xmlns:w10="urn:schemas-microsoft-com:office:word" xmlns:w14="http://schemas.microsoft.com/office/word/2010/wordml" xmlns:wpg="http://schemas.microsoft.com/office/word/2010/wordprocessingGroup" xmlns:wpi="http://schemas.microsoft.com/office/word/2010/wordprocessingInk" xmlns:wne="http://schemas.microsoft.com/office/word/2006/wordml" xmlns:wps="http://schemas.microsoft.com/office/word/2010/wordprocessingShape">
@@ -8314,7 +8284,7 @@
           <w:sz w:val="20"/>
           <w:color w:val="000000"/>
         </w:rPr>
-        <w:t xml:space="preserve">                gram[i][j] += y[i] * y[j];</w:t>
+        <w:t xml:space="preserve"> </w:t>
       </w:r>
     </w:p>
     <w:p xmlns:w="http://schemas.openxmlformats.org/wordprocessingml/2006/main" xmlns:wpc="http://schemas.microsoft.com/office/word/2010/wordprocessingCanvas" xmlns:mo="http://schemas.microsoft.com/office/mac/office/2008/main" xmlns:mc="http://schemas.openxmlformats.org/markup-compatibility/2006" xmlns:mv="urn:schemas-microsoft-com:mac:vml" xmlns:o="urn:schemas-microsoft-com:office:office" xmlns:r="http://schemas.openxmlformats.org/officeDocument/2006/relationships" xmlns:m="http://schemas.openxmlformats.org/officeDocument/2006/math" xmlns:v="urn:schemas-microsoft-com:vml" xmlns:wp14="http://schemas.microsoft.com/office/word/2010/wordprocessingDrawing" xmlns:wp="http://schemas.openxmlformats.org/drawingml/2006/wordprocessingDrawing" xmlns:w10="urn:schemas-microsoft-com:office:word" xmlns:w14="http://schemas.microsoft.com/office/word/2010/wordml" xmlns:wpg="http://schemas.microsoft.com/office/word/2010/wordprocessingGroup" xmlns:wpi="http://schemas.microsoft.com/office/word/2010/wordprocessingInk" xmlns:wne="http://schemas.microsoft.com/office/word/2006/wordml" xmlns:wps="http://schemas.microsoft.com/office/word/2010/wordprocessingShape">
@@ -8328,7 +8298,7 @@
           <w:sz w:val="20"/>
           <w:color w:val="000000"/>
         </w:rPr>
-        <w:t xml:space="preserve">        }</w:t>
+        <w:t>for (Movie movie : model.movies) {</w:t>
       </w:r>
     </w:p>
     <w:p xmlns:w="http://schemas.openxmlformats.org/wordprocessingml/2006/main" xmlns:wpc="http://schemas.microsoft.com/office/word/2010/wordprocessingCanvas" xmlns:mo="http://schemas.microsoft.com/office/mac/office/2008/main" xmlns:mc="http://schemas.openxmlformats.org/markup-compatibility/2006" xmlns:mv="urn:schemas-microsoft-com:mac:vml" xmlns:o="urn:schemas-microsoft-com:office:office" xmlns:r="http://schemas.openxmlformats.org/officeDocument/2006/relationships" xmlns:m="http://schemas.openxmlformats.org/officeDocument/2006/math" xmlns:v="urn:schemas-microsoft-com:vml" xmlns:wp14="http://schemas.microsoft.com/office/word/2010/wordprocessingDrawing" xmlns:wp="http://schemas.openxmlformats.org/drawingml/2006/wordprocessingDrawing" xmlns:w10="urn:schemas-microsoft-com:office:word" xmlns:w14="http://schemas.microsoft.com/office/word/2010/wordml" xmlns:wpg="http://schemas.microsoft.com/office/word/2010/wordprocessingGroup" xmlns:wpi="http://schemas.microsoft.com/office/word/2010/wordprocessingInk" xmlns:wne="http://schemas.microsoft.com/office/word/2006/wordml" xmlns:wps="http://schemas.microsoft.com/office/word/2010/wordprocessingShape">
@@ -8342,7 +8312,7 @@
           <w:sz w:val="20"/>
           <w:color w:val="000000"/>
         </w:rPr>
-        <w:t xml:space="preserve">    }</w:t>
+        <w:t xml:space="preserve">    if (seen.contains(movie.movieId()) ||</w:t>
       </w:r>
     </w:p>
     <w:p xmlns:w="http://schemas.openxmlformats.org/wordprocessingml/2006/main" xmlns:wpc="http://schemas.microsoft.com/office/word/2010/wordprocessingCanvas" xmlns:mo="http://schemas.microsoft.com/office/mac/office/2008/main" xmlns:mc="http://schemas.openxmlformats.org/markup-compatibility/2006" xmlns:mv="urn:schemas-microsoft-com:mac:vml" xmlns:o="urn:schemas-microsoft-com:office:office" xmlns:r="http://schemas.openxmlformats.org/officeDocument/2006/relationships" xmlns:m="http://schemas.openxmlformats.org/officeDocument/2006/math" xmlns:v="urn:schemas-microsoft-com:vml" xmlns:wp14="http://schemas.microsoft.com/office/word/2010/wordprocessingDrawing" xmlns:wp="http://schemas.openxmlformats.org/drawingml/2006/wordprocessingDrawing" xmlns:w10="urn:schemas-microsoft-com:office:word" xmlns:w14="http://schemas.microsoft.com/office/word/2010/wordml" xmlns:wpg="http://schemas.microsoft.com/office/word/2010/wordprocessingGroup" xmlns:wpi="http://schemas.microsoft.com/office/word/2010/wordprocessingInk" xmlns:wne="http://schemas.microsoft.com/office/word/2006/wordml" xmlns:wps="http://schemas.microsoft.com/office/word/2010/wordprocessingShape">
@@ -8356,7 +8326,7 @@
           <w:sz w:val="20"/>
           <w:color w:val="000000"/>
         </w:rPr>
-        <w:t xml:space="preserve">    for (int i = 0; i &lt; k; i++)</w:t>
+        <w:t xml:space="preserve">            movie.ratingCount() &lt; minimumRatings) continue;</w:t>
       </w:r>
     </w:p>
     <w:p xmlns:w="http://schemas.openxmlformats.org/wordprocessingml/2006/main" xmlns:wpc="http://schemas.microsoft.com/office/word/2010/wordprocessingCanvas" xmlns:mo="http://schemas.microsoft.com/office/mac/office/2008/main" xmlns:mc="http://schemas.openxmlformats.org/markup-compatibility/2006" xmlns:mv="urn:schemas-microsoft-com:mac:vml" xmlns:o="urn:schemas-microsoft-com:office:office" xmlns:r="http://schemas.openxmlformats.org/officeDocument/2006/relationships" xmlns:m="http://schemas.openxmlformats.org/officeDocument/2006/math" xmlns:v="urn:schemas-microsoft-com:vml" xmlns:wp14="http://schemas.microsoft.com/office/word/2010/wordprocessingDrawing" xmlns:wp="http://schemas.openxmlformats.org/drawingml/2006/wordprocessingDrawing" xmlns:w10="urn:schemas-microsoft-com:office:word" xmlns:w14="http://schemas.microsoft.com/office/word/2010/wordml" xmlns:wpg="http://schemas.microsoft.com/office/word/2010/wordprocessingGroup" xmlns:wpi="http://schemas.microsoft.com/office/word/2010/wordprocessingInk" xmlns:wne="http://schemas.microsoft.com/office/word/2006/wordml" xmlns:wps="http://schemas.microsoft.com/office/word/2010/wordprocessingShape">
@@ -8370,7 +8340,7 @@
           <w:sz w:val="20"/>
           <w:color w:val="000000"/>
         </w:rPr>
-        <w:t xml:space="preserve">        gram[i][i] += model.regParam * ratings.size();</w:t>
+        <w:t xml:space="preserve">    if (genre != null &amp;&amp; !genre.isBlank() &amp;&amp;</w:t>
       </w:r>
     </w:p>
     <w:p xmlns:w="http://schemas.openxmlformats.org/wordprocessingml/2006/main" xmlns:wpc="http://schemas.microsoft.com/office/word/2010/wordprocessingCanvas" xmlns:mo="http://schemas.microsoft.com/office/mac/office/2008/main" xmlns:mc="http://schemas.openxmlformats.org/markup-compatibility/2006" xmlns:mv="urn:schemas-microsoft-com:mac:vml" xmlns:o="urn:schemas-microsoft-com:office:office" xmlns:r="http://schemas.openxmlformats.org/officeDocument/2006/relationships" xmlns:m="http://schemas.openxmlformats.org/officeDocument/2006/math" xmlns:v="urn:schemas-microsoft-com:vml" xmlns:wp14="http://schemas.microsoft.com/office/word/2010/wordprocessingDrawing" xmlns:wp="http://schemas.openxmlformats.org/drawingml/2006/wordprocessingDrawing" xmlns:w10="urn:schemas-microsoft-com:office:word" xmlns:w14="http://schemas.microsoft.com/office/word/2010/wordml" xmlns:wpg="http://schemas.microsoft.com/office/word/2010/wordprocessingGroup" xmlns:wpi="http://schemas.microsoft.com/office/word/2010/wordprocessingInk" xmlns:wne="http://schemas.microsoft.com/office/word/2006/wordml" xmlns:wps="http://schemas.microsoft.com/office/word/2010/wordprocessingShape">
@@ -8384,7 +8354,7 @@
           <w:sz w:val="20"/>
           <w:color w:val="000000"/>
         </w:rPr>
-        <w:t xml:space="preserve">    return solve(gram, rhs);</w:t>
+        <w:t xml:space="preserve">            !Arrays.asList(movie.genres().split("\|"))</w:t>
       </w:r>
     </w:p>
     <w:p xmlns:w="http://schemas.openxmlformats.org/wordprocessingml/2006/main" xmlns:wpc="http://schemas.microsoft.com/office/word/2010/wordprocessingCanvas" xmlns:mo="http://schemas.microsoft.com/office/mac/office/2008/main" xmlns:mc="http://schemas.openxmlformats.org/markup-compatibility/2006" xmlns:mv="urn:schemas-microsoft-com:mac:vml" xmlns:o="urn:schemas-microsoft-com:office:office" xmlns:r="http://schemas.openxmlformats.org/officeDocument/2006/relationships" xmlns:m="http://schemas.openxmlformats.org/officeDocument/2006/math" xmlns:v="urn:schemas-microsoft-com:vml" xmlns:wp14="http://schemas.microsoft.com/office/word/2010/wordprocessingDrawing" xmlns:wp="http://schemas.openxmlformats.org/drawingml/2006/wordprocessingDrawing" xmlns:w10="urn:schemas-microsoft-com:office:word" xmlns:w14="http://schemas.microsoft.com/office/word/2010/wordml" xmlns:wpg="http://schemas.microsoft.com/office/word/2010/wordprocessingGroup" xmlns:wpi="http://schemas.microsoft.com/office/word/2010/wordprocessingInk" xmlns:wne="http://schemas.microsoft.com/office/word/2006/wordml" xmlns:wps="http://schemas.microsoft.com/office/word/2010/wordprocessingShape">
@@ -8398,173 +8368,7 @@
           <w:sz w:val="20"/>
           <w:color w:val="000000"/>
         </w:rPr>
-        <w:t>}</w:t>
-      </w:r>
-    </w:p>
-    <w:p xmlns:w="http://schemas.openxmlformats.org/wordprocessingml/2006/main" xmlns:wpc="http://schemas.microsoft.com/office/word/2010/wordprocessingCanvas" xmlns:mo="http://schemas.microsoft.com/office/mac/office/2008/main" xmlns:mc="http://schemas.openxmlformats.org/markup-compatibility/2006" xmlns:mv="urn:schemas-microsoft-com:mac:vml" xmlns:o="urn:schemas-microsoft-com:office:office" xmlns:r="http://schemas.openxmlformats.org/officeDocument/2006/relationships" xmlns:m="http://schemas.openxmlformats.org/officeDocument/2006/math" xmlns:v="urn:schemas-microsoft-com:vml" xmlns:wp14="http://schemas.microsoft.com/office/word/2010/wordprocessingDrawing" xmlns:wp="http://schemas.openxmlformats.org/drawingml/2006/wordprocessingDrawing" xmlns:w10="urn:schemas-microsoft-com:office:word" xmlns:w14="http://schemas.microsoft.com/office/word/2010/wordml" xmlns:wpg="http://schemas.microsoft.com/office/word/2010/wordprocessingGroup" xmlns:wpi="http://schemas.microsoft.com/office/word/2010/wordprocessingInk" xmlns:wne="http://schemas.microsoft.com/office/word/2006/wordml" xmlns:wps="http://schemas.microsoft.com/office/word/2010/wordprocessingShape">
-      <w:pPr>
-        <w:spacing w:after="100"/>
-        <w:keepLines/>
-        <w:numPr>
-          <w:ilvl w:val="0"/>
-          <w:numId w:val="1"/>
-        </w:numPr>
-        <w:ind w:left="317" w:hanging="173"/>
-      </w:pPr>
-      <w:r>
-        <w:rPr>
-          <w:rFonts w:ascii="Times New Roman" w:hAnsi="Times New Roman"/>
-          <w:b w:val="0"/>
-          <w:sz w:val="28"/>
-          <w:color w:val="000000"/>
-        </w:rPr>
-        <w:t>The first excerpt trains on prepared ratings and measures prediction error. The second calculates a new user vector from the entered ratings.</w:t>
-      </w:r>
-    </w:p>
-    <w:p xmlns:w="http://schemas.openxmlformats.org/wordprocessingml/2006/main" xmlns:wpc="http://schemas.microsoft.com/office/word/2010/wordprocessingCanvas" xmlns:mo="http://schemas.microsoft.com/office/mac/office/2008/main" xmlns:mc="http://schemas.openxmlformats.org/markup-compatibility/2006" xmlns:mv="urn:schemas-microsoft-com:mac:vml" xmlns:o="urn:schemas-microsoft-com:office:office" xmlns:r="http://schemas.openxmlformats.org/officeDocument/2006/relationships" xmlns:m="http://schemas.openxmlformats.org/officeDocument/2006/math" xmlns:v="urn:schemas-microsoft-com:vml" xmlns:wp14="http://schemas.microsoft.com/office/word/2010/wordprocessingDrawing" xmlns:wp="http://schemas.openxmlformats.org/drawingml/2006/wordprocessingDrawing" xmlns:w10="urn:schemas-microsoft-com:office:word" xmlns:w14="http://schemas.microsoft.com/office/word/2010/wordml" xmlns:wpg="http://schemas.microsoft.com/office/word/2010/wordprocessingGroup" xmlns:wpi="http://schemas.microsoft.com/office/word/2010/wordprocessingInk" xmlns:wne="http://schemas.microsoft.com/office/word/2006/wordml" xmlns:wps="http://schemas.microsoft.com/office/word/2010/wordprocessingShape">
-      <w:pPr>
-        <w:spacing w:after="100"/>
-        <w:keepLines/>
-        <w:numPr>
-          <w:ilvl w:val="0"/>
-          <w:numId w:val="1"/>
-        </w:numPr>
-        <w:ind w:left="317" w:hanging="173"/>
-      </w:pPr>
-      <w:r>
-        <w:rPr>
-          <w:rFonts w:ascii="Times New Roman" w:hAnsi="Times New Roman"/>
-          <w:b w:val="0"/>
-          <w:sz w:val="28"/>
-          <w:color w:val="000000"/>
-        </w:rPr>
-        <w:t>Complete source code, validation and setup scripts are included in the project repository.</w:t>
-      </w:r>
-    </w:p>
-    <w:p xmlns:w="http://schemas.openxmlformats.org/wordprocessingml/2006/main" xmlns:wpc="http://schemas.microsoft.com/office/word/2010/wordprocessingCanvas" xmlns:mo="http://schemas.microsoft.com/office/mac/office/2008/main" xmlns:mc="http://schemas.openxmlformats.org/markup-compatibility/2006" xmlns:mv="urn:schemas-microsoft-com:mac:vml" xmlns:o="urn:schemas-microsoft-com:office:office" xmlns:r="http://schemas.openxmlformats.org/officeDocument/2006/relationships" xmlns:m="http://schemas.openxmlformats.org/officeDocument/2006/math" xmlns:v="urn:schemas-microsoft-com:vml" xmlns:wp14="http://schemas.microsoft.com/office/word/2010/wordprocessingDrawing" xmlns:wp="http://schemas.openxmlformats.org/drawingml/2006/wordprocessingDrawing" xmlns:w10="urn:schemas-microsoft-com:office:word" xmlns:w14="http://schemas.microsoft.com/office/word/2010/wordml" xmlns:wpg="http://schemas.microsoft.com/office/word/2010/wordprocessingGroup" xmlns:wpi="http://schemas.microsoft.com/office/word/2010/wordprocessingInk" xmlns:wne="http://schemas.microsoft.com/office/word/2006/wordml" xmlns:wps="http://schemas.microsoft.com/office/word/2010/wordprocessingShape">
-      <w:pPr>
-        <w:keepNext/>
-        <w:pageBreakBefore w:val="0"/>
-        <w:spacing w:before="120" w:after="80"/>
-      </w:pPr>
-      <w:r>
-        <w:rPr>
-          <w:rFonts w:ascii="Times New Roman" w:hAnsi="Times New Roman"/>
-          <w:sz w:val="32"/>
-          <w:color w:val="000000"/>
-          <w:b/>
-        </w:rPr>
-        <w:t>Understanding the New User Calculation</w:t>
-      </w:r>
-    </w:p>
-    <w:p xmlns:w="http://schemas.openxmlformats.org/wordprocessingml/2006/main" xmlns:wpc="http://schemas.microsoft.com/office/word/2010/wordprocessingCanvas" xmlns:mo="http://schemas.microsoft.com/office/mac/office/2008/main" xmlns:mc="http://schemas.openxmlformats.org/markup-compatibility/2006" xmlns:mv="urn:schemas-microsoft-com:mac:vml" xmlns:o="urn:schemas-microsoft-com:office:office" xmlns:r="http://schemas.openxmlformats.org/officeDocument/2006/relationships" xmlns:m="http://schemas.openxmlformats.org/officeDocument/2006/math" xmlns:v="urn:schemas-microsoft-com:vml" xmlns:wp14="http://schemas.microsoft.com/office/word/2010/wordprocessingDrawing" xmlns:wp="http://schemas.openxmlformats.org/drawingml/2006/wordprocessingDrawing" xmlns:w10="urn:schemas-microsoft-com:office:word" xmlns:w14="http://schemas.microsoft.com/office/word/2010/wordml" xmlns:wpg="http://schemas.microsoft.com/office/word/2010/wordprocessingGroup" xmlns:wpi="http://schemas.microsoft.com/office/word/2010/wordprocessingInk" xmlns:wne="http://schemas.microsoft.com/office/word/2006/wordml" xmlns:wps="http://schemas.microsoft.com/office/word/2010/wordprocessingShape">
-      <w:pPr>
-        <w:spacing w:after="100"/>
-        <w:keepLines/>
-        <w:numPr>
-          <w:ilvl w:val="0"/>
-          <w:numId w:val="1"/>
-        </w:numPr>
-        <w:ind w:left="317" w:hanging="173"/>
-      </w:pPr>
-      <w:r>
-        <w:rPr>
-          <w:rFonts w:ascii="Times New Roman" w:hAnsi="Times New Roman"/>
-          <w:b w:val="0"/>
-          <w:sz w:val="28"/>
-          <w:color w:val="000000"/>
-        </w:rPr>
-        <w:t>The gram array is a 12 by 12 matrix; rhs contains 12 values because the model uses 12 factors.</w:t>
-      </w:r>
-    </w:p>
-    <w:p xmlns:w="http://schemas.openxmlformats.org/wordprocessingml/2006/main" xmlns:wpc="http://schemas.microsoft.com/office/word/2010/wordprocessingCanvas" xmlns:mo="http://schemas.microsoft.com/office/mac/office/2008/main" xmlns:mc="http://schemas.openxmlformats.org/markup-compatibility/2006" xmlns:mv="urn:schemas-microsoft-com:mac:vml" xmlns:o="urn:schemas-microsoft-com:office:office" xmlns:r="http://schemas.openxmlformats.org/officeDocument/2006/relationships" xmlns:m="http://schemas.openxmlformats.org/officeDocument/2006/math" xmlns:v="urn:schemas-microsoft-com:vml" xmlns:wp14="http://schemas.microsoft.com/office/word/2010/wordprocessingDrawing" xmlns:wp="http://schemas.openxmlformats.org/drawingml/2006/wordprocessingDrawing" xmlns:w10="urn:schemas-microsoft-com:office:word" xmlns:w14="http://schemas.microsoft.com/office/word/2010/wordml" xmlns:wpg="http://schemas.microsoft.com/office/word/2010/wordprocessingGroup" xmlns:wpi="http://schemas.microsoft.com/office/word/2010/wordprocessingInk" xmlns:wne="http://schemas.microsoft.com/office/word/2006/wordml" xmlns:wps="http://schemas.microsoft.com/office/word/2010/wordprocessingShape">
-      <w:pPr>
-        <w:spacing w:after="100"/>
-        <w:keepLines/>
-        <w:numPr>
-          <w:ilvl w:val="0"/>
-          <w:numId w:val="1"/>
-        </w:numPr>
-        <w:ind w:left="317" w:hanging="173"/>
-      </w:pPr>
-      <w:r>
-        <w:rPr>
-          <w:rFonts w:ascii="Times New Roman" w:hAnsi="Times New Roman"/>
-          <w:b w:val="0"/>
-          <w:sz w:val="28"/>
-          <w:color w:val="000000"/>
-        </w:rPr>
-        <w:t>Regularisation is added to the diagonal to keep the fitted vector from becoming too large.</w:t>
-      </w:r>
-    </w:p>
-    <w:p xmlns:w="http://schemas.openxmlformats.org/wordprocessingml/2006/main" xmlns:wpc="http://schemas.microsoft.com/office/word/2010/wordprocessingCanvas" xmlns:mo="http://schemas.microsoft.com/office/mac/office/2008/main" xmlns:mc="http://schemas.openxmlformats.org/markup-compatibility/2006" xmlns:mv="urn:schemas-microsoft-com:mac:vml" xmlns:o="urn:schemas-microsoft-com:office:office" xmlns:r="http://schemas.openxmlformats.org/officeDocument/2006/relationships" xmlns:m="http://schemas.openxmlformats.org/officeDocument/2006/math" xmlns:v="urn:schemas-microsoft-com:vml" xmlns:wp14="http://schemas.microsoft.com/office/word/2010/wordprocessingDrawing" xmlns:wp="http://schemas.openxmlformats.org/drawingml/2006/wordprocessingDrawing" xmlns:w10="urn:schemas-microsoft-com:office:word" xmlns:w14="http://schemas.microsoft.com/office/word/2010/wordml" xmlns:wpg="http://schemas.microsoft.com/office/word/2010/wordprocessingGroup" xmlns:wpi="http://schemas.microsoft.com/office/word/2010/wordprocessingInk" xmlns:wne="http://schemas.microsoft.com/office/word/2006/wordml" xmlns:wps="http://schemas.microsoft.com/office/word/2010/wordprocessingShape">
-      <w:pPr>
-        <w:spacing w:after="100"/>
-        <w:keepLines/>
-        <w:numPr>
-          <w:ilvl w:val="0"/>
-          <w:numId w:val="1"/>
-        </w:numPr>
-        <w:ind w:left="317" w:hanging="173"/>
-      </w:pPr>
-      <w:r>
-        <w:rPr>
-          <w:rFonts w:ascii="Times New Roman" w:hAnsi="Times New Roman"/>
-          <w:b w:val="0"/>
-          <w:sz w:val="28"/>
-          <w:color w:val="000000"/>
-        </w:rPr>
-        <w:t>The solve method uses pivoted elimination to return the new user vector for ranking movies.</w:t>
-      </w:r>
-    </w:p>
-    <w:p xmlns:w="http://schemas.openxmlformats.org/wordprocessingml/2006/main" xmlns:wpc="http://schemas.microsoft.com/office/word/2010/wordprocessingCanvas" xmlns:mo="http://schemas.microsoft.com/office/mac/office/2008/main" xmlns:mc="http://schemas.openxmlformats.org/markup-compatibility/2006" xmlns:mv="urn:schemas-microsoft-com:mac:vml" xmlns:o="urn:schemas-microsoft-com:office:office" xmlns:r="http://schemas.openxmlformats.org/officeDocument/2006/relationships" xmlns:m="http://schemas.openxmlformats.org/officeDocument/2006/math" xmlns:v="urn:schemas-microsoft-com:vml" xmlns:wp14="http://schemas.microsoft.com/office/word/2010/wordprocessingDrawing" xmlns:wp="http://schemas.openxmlformats.org/drawingml/2006/wordprocessingDrawing" xmlns:w10="urn:schemas-microsoft-com:office:word" xmlns:w14="http://schemas.microsoft.com/office/word/2010/wordml" xmlns:wpg="http://schemas.microsoft.com/office/word/2010/wordprocessingGroup" xmlns:wpi="http://schemas.microsoft.com/office/word/2010/wordprocessingInk" xmlns:wne="http://schemas.microsoft.com/office/word/2006/wordml" xmlns:wps="http://schemas.microsoft.com/office/word/2010/wordprocessingShape">
-      <w:pPr>
-        <w:spacing w:after="100"/>
-        <w:keepLines/>
-        <w:numPr>
-          <w:ilvl w:val="0"/>
-          <w:numId w:val="1"/>
-        </w:numPr>
-        <w:ind w:left="317" w:hanging="173"/>
-      </w:pPr>
-      <w:r>
-        <w:rPr>
-          <w:rFonts w:ascii="Times New Roman" w:hAnsi="Times New Roman"/>
-          <w:b w:val="0"/>
-          <w:sz w:val="28"/>
-          <w:color w:val="000000"/>
-        </w:rPr>
-        <w:t>The caller first checks movie IDs, duplicate entries and half-star ratings.</w:t>
-      </w:r>
-    </w:p>
-    <w:p xmlns:w="http://schemas.openxmlformats.org/wordprocessingml/2006/main" xmlns:wpc="http://schemas.microsoft.com/office/word/2010/wordprocessingCanvas" xmlns:mo="http://schemas.microsoft.com/office/mac/office/2008/main" xmlns:mc="http://schemas.openxmlformats.org/markup-compatibility/2006" xmlns:mv="urn:schemas-microsoft-com:mac:vml" xmlns:o="urn:schemas-microsoft-com:office:office" xmlns:r="http://schemas.openxmlformats.org/officeDocument/2006/relationships" xmlns:m="http://schemas.openxmlformats.org/officeDocument/2006/math" xmlns:v="urn:schemas-microsoft-com:vml" xmlns:wp14="http://schemas.microsoft.com/office/word/2010/wordprocessingDrawing" xmlns:wp="http://schemas.openxmlformats.org/drawingml/2006/wordprocessingDrawing" xmlns:w10="urn:schemas-microsoft-com:office:word" xmlns:w14="http://schemas.microsoft.com/office/word/2010/wordml" xmlns:wpg="http://schemas.microsoft.com/office/word/2010/wordprocessingGroup" xmlns:wpi="http://schemas.microsoft.com/office/word/2010/wordprocessingInk" xmlns:wne="http://schemas.microsoft.com/office/word/2006/wordml" xmlns:wps="http://schemas.microsoft.com/office/word/2010/wordprocessingShape">
-      <w:pPr>
-        <w:keepNext/>
-        <w:pageBreakBefore/>
-        <w:spacing w:before="120" w:after="80"/>
-      </w:pPr>
-      <w:r>
-        <w:rPr>
-          <w:rFonts w:ascii="Times New Roman" w:hAnsi="Times New Roman"/>
-          <w:sz w:val="32"/>
-          <w:color w:val="000000"/>
-          <w:b/>
-        </w:rPr>
-        <w:t>9.2 Scoring and Filtering Code</w:t>
-      </w:r>
-    </w:p>
-    <w:p xmlns:w="http://schemas.openxmlformats.org/wordprocessingml/2006/main" xmlns:wpc="http://schemas.microsoft.com/office/word/2010/wordprocessingCanvas" xmlns:mo="http://schemas.microsoft.com/office/mac/office/2008/main" xmlns:mc="http://schemas.openxmlformats.org/markup-compatibility/2006" xmlns:mv="urn:schemas-microsoft-com:mac:vml" xmlns:o="urn:schemas-microsoft-com:office:office" xmlns:r="http://schemas.openxmlformats.org/officeDocument/2006/relationships" xmlns:m="http://schemas.openxmlformats.org/officeDocument/2006/math" xmlns:v="urn:schemas-microsoft-com:vml" xmlns:wp14="http://schemas.microsoft.com/office/word/2010/wordprocessingDrawing" xmlns:wp="http://schemas.openxmlformats.org/drawingml/2006/wordprocessingDrawing" xmlns:w10="urn:schemas-microsoft-com:office:word" xmlns:w14="http://schemas.microsoft.com/office/word/2010/wordml" xmlns:wpg="http://schemas.microsoft.com/office/word/2010/wordprocessingGroup" xmlns:wpi="http://schemas.microsoft.com/office/word/2010/wordprocessingInk" xmlns:wne="http://schemas.microsoft.com/office/word/2006/wordml" xmlns:wps="http://schemas.microsoft.com/office/word/2010/wordprocessingShape">
-      <w:pPr>
-        <w:spacing w:after="100"/>
-      </w:pPr>
-      <w:r>
-        <w:rPr>
-          <w:rFonts w:ascii="Times New Roman" w:hAnsi="Times New Roman"/>
-          <w:b/>
-          <w:sz w:val="24"/>
-          <w:color w:val="000000"/>
-        </w:rPr>
-        <w:t>Existing user history and vector lookup</w:t>
+        <w:t xml:space="preserve">                .contains(genre)) continue;</w:t>
       </w:r>
     </w:p>
     <w:p xmlns:w="http://schemas.openxmlformats.org/wordprocessingml/2006/main" xmlns:wpc="http://schemas.microsoft.com/office/word/2010/wordprocessingCanvas" xmlns:mo="http://schemas.microsoft.com/office/mac/office/2008/main" xmlns:mc="http://schemas.openxmlformats.org/markup-compatibility/2006" xmlns:mv="urn:schemas-microsoft-com:mac:vml" xmlns:o="urn:schemas-microsoft-com:office:office" xmlns:r="http://schemas.openxmlformats.org/officeDocument/2006/relationships" xmlns:m="http://schemas.openxmlformats.org/officeDocument/2006/math" xmlns:v="urn:schemas-microsoft-com:vml" xmlns:wp14="http://schemas.microsoft.com/office/word/2010/wordprocessingDrawing" xmlns:wp="http://schemas.openxmlformats.org/drawingml/2006/wordprocessingDrawing" xmlns:w10="urn:schemas-microsoft-com:office:word" xmlns:w14="http://schemas.microsoft.com/office/word/2010/wordml" xmlns:wpg="http://schemas.microsoft.com/office/word/2010/wordprocessingGroup" xmlns:wpi="http://schemas.microsoft.com/office/word/2010/wordprocessingInk" xmlns:wne="http://schemas.microsoft.com/office/word/2006/wordml" xmlns:wps="http://schemas.microsoft.com/office/word/2010/wordprocessingShape">
@@ -8578,7 +8382,7 @@
           <w:sz w:val="20"/>
           <w:color w:val="000000"/>
         </w:rPr>
-        <w:t>public List&lt;Recommendation&gt; forUser(int id, int limit,</w:t>
+        <w:t xml:space="preserve">    double[] item = model.items.get(movie.movieId());</w:t>
       </w:r>
     </w:p>
     <w:p xmlns:w="http://schemas.openxmlformats.org/wordprocessingml/2006/main" xmlns:wpc="http://schemas.microsoft.com/office/word/2010/wordprocessingCanvas" xmlns:mo="http://schemas.microsoft.com/office/mac/office/2008/main" xmlns:mc="http://schemas.openxmlformats.org/markup-compatibility/2006" xmlns:mv="urn:schemas-microsoft-com:mac:vml" xmlns:o="urn:schemas-microsoft-com:office:office" xmlns:r="http://schemas.openxmlformats.org/officeDocument/2006/relationships" xmlns:m="http://schemas.openxmlformats.org/officeDocument/2006/math" xmlns:v="urn:schemas-microsoft-com:vml" xmlns:wp14="http://schemas.microsoft.com/office/word/2010/wordprocessingDrawing" xmlns:wp="http://schemas.openxmlformats.org/drawingml/2006/wordprocessingDrawing" xmlns:w10="urn:schemas-microsoft-com:office:word" xmlns:w14="http://schemas.microsoft.com/office/word/2010/wordml" xmlns:wpg="http://schemas.microsoft.com/office/word/2010/wordprocessingGroup" xmlns:wpi="http://schemas.microsoft.com/office/word/2010/wordprocessingInk" xmlns:wne="http://schemas.microsoft.com/office/word/2006/wordml" xmlns:wps="http://schemas.microsoft.com/office/word/2010/wordprocessingShape">
@@ -8592,7 +8396,7 @@
           <w:sz w:val="20"/>
           <w:color w:val="000000"/>
         </w:rPr>
-        <w:t xml:space="preserve">        String genre, int minimumRatings) {</w:t>
+        <w:t xml:space="preserve">    if (vector != null &amp;&amp; item == null) continue;</w:t>
       </w:r>
     </w:p>
     <w:p xmlns:w="http://schemas.openxmlformats.org/wordprocessingml/2006/main" xmlns:wpc="http://schemas.microsoft.com/office/word/2010/wordprocessingCanvas" xmlns:mo="http://schemas.microsoft.com/office/mac/office/2008/main" xmlns:mc="http://schemas.openxmlformats.org/markup-compatibility/2006" xmlns:mv="urn:schemas-microsoft-com:mac:vml" xmlns:o="urn:schemas-microsoft-com:office:office" xmlns:r="http://schemas.openxmlformats.org/officeDocument/2006/relationships" xmlns:m="http://schemas.openxmlformats.org/officeDocument/2006/math" xmlns:v="urn:schemas-microsoft-com:vml" xmlns:wp14="http://schemas.microsoft.com/office/word/2010/wordprocessingDrawing" xmlns:wp="http://schemas.openxmlformats.org/drawingml/2006/wordprocessingDrawing" xmlns:w10="urn:schemas-microsoft-com:office:word" xmlns:w14="http://schemas.microsoft.com/office/word/2010/wordml" xmlns:wpg="http://schemas.microsoft.com/office/word/2010/wordprocessingGroup" xmlns:wpi="http://schemas.microsoft.com/office/word/2010/wordprocessingInk" xmlns:wne="http://schemas.microsoft.com/office/word/2006/wordml" xmlns:wps="http://schemas.microsoft.com/office/word/2010/wordprocessingShape">
@@ -8606,7 +8410,7 @@
           <w:sz w:val="20"/>
           <w:color w:val="000000"/>
         </w:rPr>
-        <w:t xml:space="preserve">    Set&lt;Integer&gt; seen = new HashSet&lt;&gt;();</w:t>
+        <w:t xml:space="preserve">    double score = vector == null</w:t>
       </w:r>
     </w:p>
     <w:p xmlns:w="http://schemas.openxmlformats.org/wordprocessingml/2006/main" xmlns:wpc="http://schemas.microsoft.com/office/word/2010/wordprocessingCanvas" xmlns:mo="http://schemas.microsoft.com/office/mac/office/2008/main" xmlns:mc="http://schemas.openxmlformats.org/markup-compatibility/2006" xmlns:mv="urn:schemas-microsoft-com:mac:vml" xmlns:o="urn:schemas-microsoft-com:office:office" xmlns:r="http://schemas.openxmlformats.org/officeDocument/2006/relationships" xmlns:m="http://schemas.openxmlformats.org/officeDocument/2006/math" xmlns:v="urn:schemas-microsoft-com:vml" xmlns:wp14="http://schemas.microsoft.com/office/word/2010/wordprocessingDrawing" xmlns:wp="http://schemas.openxmlformats.org/drawingml/2006/wordprocessingDrawing" xmlns:w10="urn:schemas-microsoft-com:office:word" xmlns:w14="http://schemas.microsoft.com/office/word/2010/wordml" xmlns:wpg="http://schemas.microsoft.com/office/word/2010/wordprocessingGroup" xmlns:wpi="http://schemas.microsoft.com/office/word/2010/wordprocessingInk" xmlns:wne="http://schemas.microsoft.com/office/word/2006/wordml" xmlns:wps="http://schemas.microsoft.com/office/word/2010/wordprocessingShape">
@@ -8620,7 +8424,7 @@
           <w:sz w:val="20"/>
           <w:color w:val="000000"/>
         </w:rPr>
-        <w:t xml:space="preserve">    for (Rating r : model.histories.getOrDefault(id, List.of()))</w:t>
+        <w:t xml:space="preserve">        ? movie.weightedRating() : dot(vector, item);</w:t>
       </w:r>
     </w:p>
     <w:p xmlns:w="http://schemas.openxmlformats.org/wordprocessingml/2006/main" xmlns:wpc="http://schemas.microsoft.com/office/word/2010/wordprocessingCanvas" xmlns:mo="http://schemas.microsoft.com/office/mac/office/2008/main" xmlns:mc="http://schemas.openxmlformats.org/markup-compatibility/2006" xmlns:mv="urn:schemas-microsoft-com:mac:vml" xmlns:o="urn:schemas-microsoft-com:office:office" xmlns:r="http://schemas.openxmlformats.org/officeDocument/2006/relationships" xmlns:m="http://schemas.openxmlformats.org/officeDocument/2006/math" xmlns:v="urn:schemas-microsoft-com:vml" xmlns:wp14="http://schemas.microsoft.com/office/word/2010/wordprocessingDrawing" xmlns:wp="http://schemas.openxmlformats.org/drawingml/2006/wordprocessingDrawing" xmlns:w10="urn:schemas-microsoft-com:office:word" xmlns:w14="http://schemas.microsoft.com/office/word/2010/wordml" xmlns:wpg="http://schemas.microsoft.com/office/word/2010/wordprocessingGroup" xmlns:wpi="http://schemas.microsoft.com/office/word/2010/wordprocessingInk" xmlns:wne="http://schemas.microsoft.com/office/word/2006/wordml" xmlns:wps="http://schemas.microsoft.com/office/word/2010/wordprocessingShape">
@@ -8634,7 +8438,7 @@
           <w:sz w:val="20"/>
           <w:color w:val="000000"/>
         </w:rPr>
-        <w:t xml:space="preserve">        seen.add(r.movieId());</w:t>
+        <w:t xml:space="preserve">    if (Double.isFinite(score))</w:t>
       </w:r>
     </w:p>
     <w:p xmlns:w="http://schemas.openxmlformats.org/wordprocessingml/2006/main" xmlns:wpc="http://schemas.microsoft.com/office/word/2010/wordprocessingCanvas" xmlns:mo="http://schemas.microsoft.com/office/mac/office/2008/main" xmlns:mc="http://schemas.openxmlformats.org/markup-compatibility/2006" xmlns:mv="urn:schemas-microsoft-com:mac:vml" xmlns:o="urn:schemas-microsoft-com:office:office" xmlns:r="http://schemas.openxmlformats.org/officeDocument/2006/relationships" xmlns:m="http://schemas.openxmlformats.org/officeDocument/2006/math" xmlns:v="urn:schemas-microsoft-com:vml" xmlns:wp14="http://schemas.microsoft.com/office/word/2010/wordprocessingDrawing" xmlns:wp="http://schemas.openxmlformats.org/drawingml/2006/wordprocessingDrawing" xmlns:w10="urn:schemas-microsoft-com:office:word" xmlns:w14="http://schemas.microsoft.com/office/word/2010/wordml" xmlns:wpg="http://schemas.microsoft.com/office/word/2010/wordprocessingGroup" xmlns:wpi="http://schemas.microsoft.com/office/word/2010/wordprocessingInk" xmlns:wne="http://schemas.microsoft.com/office/word/2006/wordml" xmlns:wps="http://schemas.microsoft.com/office/word/2010/wordprocessingShape">
@@ -8648,7 +8452,7 @@
           <w:sz w:val="20"/>
           <w:color w:val="000000"/>
         </w:rPr>
-        <w:t xml:space="preserve">    return rank(model.users.get(id), seen, limit,</w:t>
+        <w:t xml:space="preserve">        result.add(new Recommendation(movie.movieId(),</w:t>
       </w:r>
     </w:p>
     <w:p xmlns:w="http://schemas.openxmlformats.org/wordprocessingml/2006/main" xmlns:wpc="http://schemas.microsoft.com/office/word/2010/wordprocessingCanvas" xmlns:mo="http://schemas.microsoft.com/office/mac/office/2008/main" xmlns:mc="http://schemas.openxmlformats.org/markup-compatibility/2006" xmlns:mv="urn:schemas-microsoft-com:mac:vml" xmlns:o="urn:schemas-microsoft-com:office:office" xmlns:r="http://schemas.openxmlformats.org/officeDocument/2006/relationships" xmlns:m="http://schemas.openxmlformats.org/officeDocument/2006/math" xmlns:v="urn:schemas-microsoft-com:vml" xmlns:wp14="http://schemas.microsoft.com/office/word/2010/wordprocessingDrawing" xmlns:wp="http://schemas.openxmlformats.org/drawingml/2006/wordprocessingDrawing" xmlns:w10="urn:schemas-microsoft-com:office:word" xmlns:w14="http://schemas.microsoft.com/office/word/2010/wordml" xmlns:wpg="http://schemas.microsoft.com/office/word/2010/wordprocessingGroup" xmlns:wpi="http://schemas.microsoft.com/office/word/2010/wordprocessingInk" xmlns:wne="http://schemas.microsoft.com/office/word/2006/wordml" xmlns:wps="http://schemas.microsoft.com/office/word/2010/wordprocessingShape">
@@ -8662,7 +8466,7 @@
           <w:sz w:val="20"/>
           <w:color w:val="000000"/>
         </w:rPr>
-        <w:t xml:space="preserve">                genre, minimumRatings);</w:t>
+        <w:t xml:space="preserve">            movie.title(), movie.genres(), movie.ratingCount(),</w:t>
       </w:r>
     </w:p>
     <w:p xmlns:w="http://schemas.openxmlformats.org/wordprocessingml/2006/main" xmlns:wpc="http://schemas.microsoft.com/office/word/2010/wordprocessingCanvas" xmlns:mo="http://schemas.microsoft.com/office/mac/office/2008/main" xmlns:mc="http://schemas.openxmlformats.org/markup-compatibility/2006" xmlns:mv="urn:schemas-microsoft-com:mac:vml" xmlns:o="urn:schemas-microsoft-com:office:office" xmlns:r="http://schemas.openxmlformats.org/officeDocument/2006/relationships" xmlns:m="http://schemas.openxmlformats.org/officeDocument/2006/math" xmlns:v="urn:schemas-microsoft-com:vml" xmlns:wp14="http://schemas.microsoft.com/office/word/2010/wordprocessingDrawing" xmlns:wp="http://schemas.openxmlformats.org/drawingml/2006/wordprocessingDrawing" xmlns:w10="urn:schemas-microsoft-com:office:word" xmlns:w14="http://schemas.microsoft.com/office/word/2010/wordml" xmlns:wpg="http://schemas.microsoft.com/office/word/2010/wordprocessingGroup" xmlns:wpi="http://schemas.microsoft.com/office/word/2010/wordprocessingInk" xmlns:wne="http://schemas.microsoft.com/office/word/2006/wordml" xmlns:wps="http://schemas.microsoft.com/office/word/2010/wordprocessingShape">
@@ -8676,57 +8480,7 @@
           <w:sz w:val="20"/>
           <w:color w:val="000000"/>
         </w:rPr>
-        <w:t>}</w:t>
-      </w:r>
-    </w:p>
-    <w:p xmlns:w="http://schemas.openxmlformats.org/wordprocessingml/2006/main" xmlns:wpc="http://schemas.microsoft.com/office/word/2010/wordprocessingCanvas" xmlns:mo="http://schemas.microsoft.com/office/mac/office/2008/main" xmlns:mc="http://schemas.openxmlformats.org/markup-compatibility/2006" xmlns:mv="urn:schemas-microsoft-com:mac:vml" xmlns:o="urn:schemas-microsoft-com:office:office" xmlns:r="http://schemas.openxmlformats.org/officeDocument/2006/relationships" xmlns:m="http://schemas.openxmlformats.org/officeDocument/2006/math" xmlns:v="urn:schemas-microsoft-com:vml" xmlns:wp14="http://schemas.microsoft.com/office/word/2010/wordprocessingDrawing" xmlns:wp="http://schemas.openxmlformats.org/drawingml/2006/wordprocessingDrawing" xmlns:w10="urn:schemas-microsoft-com:office:word" xmlns:w14="http://schemas.microsoft.com/office/word/2010/wordml" xmlns:wpg="http://schemas.microsoft.com/office/word/2010/wordprocessingGroup" xmlns:wpi="http://schemas.microsoft.com/office/word/2010/wordprocessingInk" xmlns:wne="http://schemas.microsoft.com/office/word/2006/wordml" xmlns:wps="http://schemas.microsoft.com/office/word/2010/wordprocessingShape">
-      <w:pPr>
-        <w:spacing w:after="100"/>
-        <w:keepLines/>
-        <w:numPr>
-          <w:ilvl w:val="0"/>
-          <w:numId w:val="1"/>
-        </w:numPr>
-        <w:ind w:left="317" w:hanging="173"/>
-      </w:pPr>
-      <w:r>
-        <w:rPr>
-          <w:rFonts w:ascii="Times New Roman" w:hAnsi="Times New Roman"/>
-          <w:b w:val="0"/>
-          <w:sz w:val="28"/>
-          <w:color w:val="000000"/>
-        </w:rPr>
-        <w:t>The seen set contains every movie rated by the user. It is passed to the ranking method along with the saved user vector.</w:t>
-      </w:r>
-    </w:p>
-    <w:p xmlns:w="http://schemas.openxmlformats.org/wordprocessingml/2006/main" xmlns:wpc="http://schemas.microsoft.com/office/word/2010/wordprocessingCanvas" xmlns:mo="http://schemas.microsoft.com/office/mac/office/2008/main" xmlns:mc="http://schemas.openxmlformats.org/markup-compatibility/2006" xmlns:mv="urn:schemas-microsoft-com:mac:vml" xmlns:o="urn:schemas-microsoft-com:office:office" xmlns:r="http://schemas.openxmlformats.org/officeDocument/2006/relationships" xmlns:m="http://schemas.openxmlformats.org/officeDocument/2006/math" xmlns:v="urn:schemas-microsoft-com:vml" xmlns:wp14="http://schemas.microsoft.com/office/word/2010/wordprocessingDrawing" xmlns:wp="http://schemas.openxmlformats.org/drawingml/2006/wordprocessingDrawing" xmlns:w10="urn:schemas-microsoft-com:office:word" xmlns:w14="http://schemas.microsoft.com/office/word/2010/wordml" xmlns:wpg="http://schemas.microsoft.com/office/word/2010/wordprocessingGroup" xmlns:wpi="http://schemas.microsoft.com/office/word/2010/wordprocessingInk" xmlns:wne="http://schemas.microsoft.com/office/word/2006/wordml" xmlns:wps="http://schemas.microsoft.com/office/word/2010/wordprocessingShape">
-      <w:pPr>
-        <w:keepNext/>
-        <w:pageBreakBefore w:val="0"/>
-        <w:spacing w:before="120" w:after="80"/>
-      </w:pPr>
-      <w:r>
-        <w:rPr>
-          <w:rFonts w:ascii="Times New Roman" w:hAnsi="Times New Roman"/>
-          <w:sz w:val="32"/>
-          <w:color w:val="000000"/>
-          <w:b/>
-        </w:rPr>
-        <w:t>9.3 Candidate Scoring</w:t>
-      </w:r>
-    </w:p>
-    <w:p xmlns:w="http://schemas.openxmlformats.org/wordprocessingml/2006/main" xmlns:wpc="http://schemas.microsoft.com/office/word/2010/wordprocessingCanvas" xmlns:mo="http://schemas.microsoft.com/office/mac/office/2008/main" xmlns:mc="http://schemas.openxmlformats.org/markup-compatibility/2006" xmlns:mv="urn:schemas-microsoft-com:mac:vml" xmlns:o="urn:schemas-microsoft-com:office:office" xmlns:r="http://schemas.openxmlformats.org/officeDocument/2006/relationships" xmlns:m="http://schemas.openxmlformats.org/officeDocument/2006/math" xmlns:v="urn:schemas-microsoft-com:vml" xmlns:wp14="http://schemas.microsoft.com/office/word/2010/wordprocessingDrawing" xmlns:wp="http://schemas.openxmlformats.org/drawingml/2006/wordprocessingDrawing" xmlns:w10="urn:schemas-microsoft-com:office:word" xmlns:w14="http://schemas.microsoft.com/office/word/2010/wordml" xmlns:wpg="http://schemas.microsoft.com/office/word/2010/wordprocessingGroup" xmlns:wpi="http://schemas.microsoft.com/office/word/2010/wordprocessingInk" xmlns:wne="http://schemas.microsoft.com/office/word/2006/wordml" xmlns:wps="http://schemas.microsoft.com/office/word/2010/wordprocessingShape">
-      <w:pPr>
-        <w:spacing w:after="100"/>
-      </w:pPr>
-      <w:r>
-        <w:rPr>
-          <w:rFonts w:ascii="Times New Roman" w:hAnsi="Times New Roman"/>
-          <w:b/>
-          <w:sz w:val="24"/>
-          <w:color w:val="000000"/>
-        </w:rPr>
-        <w:t>Core loop from the rank method</w:t>
+        <w:t xml:space="preserve">            movie.averageRating(), score));</w:t>
       </w:r>
     </w:p>
     <w:p xmlns:w="http://schemas.openxmlformats.org/wordprocessingml/2006/main" xmlns:wpc="http://schemas.microsoft.com/office/word/2010/wordprocessingCanvas" xmlns:mo="http://schemas.microsoft.com/office/mac/office/2008/main" xmlns:mc="http://schemas.openxmlformats.org/markup-compatibility/2006" xmlns:mv="urn:schemas-microsoft-com:mac:vml" xmlns:o="urn:schemas-microsoft-com:office:office" xmlns:r="http://schemas.openxmlformats.org/officeDocument/2006/relationships" xmlns:m="http://schemas.openxmlformats.org/officeDocument/2006/math" xmlns:v="urn:schemas-microsoft-com:vml" xmlns:wp14="http://schemas.microsoft.com/office/word/2010/wordprocessingDrawing" xmlns:wp="http://schemas.openxmlformats.org/drawingml/2006/wordprocessingDrawing" xmlns:w10="urn:schemas-microsoft-com:office:word" xmlns:w14="http://schemas.microsoft.com/office/word/2010/wordml" xmlns:wpg="http://schemas.microsoft.com/office/word/2010/wordprocessingGroup" xmlns:wpi="http://schemas.microsoft.com/office/word/2010/wordprocessingInk" xmlns:wne="http://schemas.microsoft.com/office/word/2006/wordml" xmlns:wps="http://schemas.microsoft.com/office/word/2010/wordprocessingShape">
@@ -8740,263 +8494,7 @@
           <w:sz w:val="20"/>
           <w:color w:val="000000"/>
         </w:rPr>
-        <w:t>for (Movie movie : model.movies) {</w:t>
-      </w:r>
-    </w:p>
-    <w:p xmlns:w="http://schemas.openxmlformats.org/wordprocessingml/2006/main" xmlns:wpc="http://schemas.microsoft.com/office/word/2010/wordprocessingCanvas" xmlns:mo="http://schemas.microsoft.com/office/mac/office/2008/main" xmlns:mc="http://schemas.openxmlformats.org/markup-compatibility/2006" xmlns:mv="urn:schemas-microsoft-com:mac:vml" xmlns:o="urn:schemas-microsoft-com:office:office" xmlns:r="http://schemas.openxmlformats.org/officeDocument/2006/relationships" xmlns:m="http://schemas.openxmlformats.org/officeDocument/2006/math" xmlns:v="urn:schemas-microsoft-com:vml" xmlns:wp14="http://schemas.microsoft.com/office/word/2010/wordprocessingDrawing" xmlns:wp="http://schemas.openxmlformats.org/drawingml/2006/wordprocessingDrawing" xmlns:w10="urn:schemas-microsoft-com:office:word" xmlns:w14="http://schemas.microsoft.com/office/word/2010/wordml" xmlns:wpg="http://schemas.microsoft.com/office/word/2010/wordprocessingGroup" xmlns:wpi="http://schemas.microsoft.com/office/word/2010/wordprocessingInk" xmlns:wne="http://schemas.microsoft.com/office/word/2006/wordml" xmlns:wps="http://schemas.microsoft.com/office/word/2010/wordprocessingShape">
-      <w:pPr>
-        <w:keepLines/>
-        <w:spacing w:after="0" w:line="230" w:lineRule="exact"/>
-      </w:pPr>
-      <w:r>
-        <w:rPr>
-          <w:rFonts w:ascii="Consolas" w:hAnsi="Consolas"/>
-          <w:sz w:val="20"/>
-          <w:color w:val="000000"/>
-        </w:rPr>
-        <w:t xml:space="preserve">    if (seen.contains(movie.movieId()) ||</w:t>
-      </w:r>
-    </w:p>
-    <w:p xmlns:w="http://schemas.openxmlformats.org/wordprocessingml/2006/main" xmlns:wpc="http://schemas.microsoft.com/office/word/2010/wordprocessingCanvas" xmlns:mo="http://schemas.microsoft.com/office/mac/office/2008/main" xmlns:mc="http://schemas.openxmlformats.org/markup-compatibility/2006" xmlns:mv="urn:schemas-microsoft-com:mac:vml" xmlns:o="urn:schemas-microsoft-com:office:office" xmlns:r="http://schemas.openxmlformats.org/officeDocument/2006/relationships" xmlns:m="http://schemas.openxmlformats.org/officeDocument/2006/math" xmlns:v="urn:schemas-microsoft-com:vml" xmlns:wp14="http://schemas.microsoft.com/office/word/2010/wordprocessingDrawing" xmlns:wp="http://schemas.openxmlformats.org/drawingml/2006/wordprocessingDrawing" xmlns:w10="urn:schemas-microsoft-com:office:word" xmlns:w14="http://schemas.microsoft.com/office/word/2010/wordml" xmlns:wpg="http://schemas.microsoft.com/office/word/2010/wordprocessingGroup" xmlns:wpi="http://schemas.microsoft.com/office/word/2010/wordprocessingInk" xmlns:wne="http://schemas.microsoft.com/office/word/2006/wordml" xmlns:wps="http://schemas.microsoft.com/office/word/2010/wordprocessingShape">
-      <w:pPr>
-        <w:keepLines/>
-        <w:spacing w:after="0" w:line="230" w:lineRule="exact"/>
-      </w:pPr>
-      <w:r>
-        <w:rPr>
-          <w:rFonts w:ascii="Consolas" w:hAnsi="Consolas"/>
-          <w:sz w:val="20"/>
-          <w:color w:val="000000"/>
-        </w:rPr>
-        <w:t xml:space="preserve">            movie.ratingCount() &lt; minimumRatings) continue;</w:t>
-      </w:r>
-    </w:p>
-    <w:p xmlns:w="http://schemas.openxmlformats.org/wordprocessingml/2006/main" xmlns:wpc="http://schemas.microsoft.com/office/word/2010/wordprocessingCanvas" xmlns:mo="http://schemas.microsoft.com/office/mac/office/2008/main" xmlns:mc="http://schemas.openxmlformats.org/markup-compatibility/2006" xmlns:mv="urn:schemas-microsoft-com:mac:vml" xmlns:o="urn:schemas-microsoft-com:office:office" xmlns:r="http://schemas.openxmlformats.org/officeDocument/2006/relationships" xmlns:m="http://schemas.openxmlformats.org/officeDocument/2006/math" xmlns:v="urn:schemas-microsoft-com:vml" xmlns:wp14="http://schemas.microsoft.com/office/word/2010/wordprocessingDrawing" xmlns:wp="http://schemas.openxmlformats.org/drawingml/2006/wordprocessingDrawing" xmlns:w10="urn:schemas-microsoft-com:office:word" xmlns:w14="http://schemas.microsoft.com/office/word/2010/wordml" xmlns:wpg="http://schemas.microsoft.com/office/word/2010/wordprocessingGroup" xmlns:wpi="http://schemas.microsoft.com/office/word/2010/wordprocessingInk" xmlns:wne="http://schemas.microsoft.com/office/word/2006/wordml" xmlns:wps="http://schemas.microsoft.com/office/word/2010/wordprocessingShape">
-      <w:pPr>
-        <w:keepLines/>
-        <w:spacing w:after="0" w:line="230" w:lineRule="exact"/>
-      </w:pPr>
-      <w:r>
-        <w:rPr>
-          <w:rFonts w:ascii="Consolas" w:hAnsi="Consolas"/>
-          <w:sz w:val="20"/>
-          <w:color w:val="000000"/>
-        </w:rPr>
-        <w:t xml:space="preserve">    if (genre != null &amp;&amp; !genre.isBlank() &amp;&amp;</w:t>
-      </w:r>
-    </w:p>
-    <w:p xmlns:w="http://schemas.openxmlformats.org/wordprocessingml/2006/main" xmlns:wpc="http://schemas.microsoft.com/office/word/2010/wordprocessingCanvas" xmlns:mo="http://schemas.microsoft.com/office/mac/office/2008/main" xmlns:mc="http://schemas.openxmlformats.org/markup-compatibility/2006" xmlns:mv="urn:schemas-microsoft-com:mac:vml" xmlns:o="urn:schemas-microsoft-com:office:office" xmlns:r="http://schemas.openxmlformats.org/officeDocument/2006/relationships" xmlns:m="http://schemas.openxmlformats.org/officeDocument/2006/math" xmlns:v="urn:schemas-microsoft-com:vml" xmlns:wp14="http://schemas.microsoft.com/office/word/2010/wordprocessingDrawing" xmlns:wp="http://schemas.openxmlformats.org/drawingml/2006/wordprocessingDrawing" xmlns:w10="urn:schemas-microsoft-com:office:word" xmlns:w14="http://schemas.microsoft.com/office/word/2010/wordml" xmlns:wpg="http://schemas.microsoft.com/office/word/2010/wordprocessingGroup" xmlns:wpi="http://schemas.microsoft.com/office/word/2010/wordprocessingInk" xmlns:wne="http://schemas.microsoft.com/office/word/2006/wordml" xmlns:wps="http://schemas.microsoft.com/office/word/2010/wordprocessingShape">
-      <w:pPr>
-        <w:keepLines/>
-        <w:spacing w:after="0" w:line="230" w:lineRule="exact"/>
-      </w:pPr>
-      <w:r>
-        <w:rPr>
-          <w:rFonts w:ascii="Consolas" w:hAnsi="Consolas"/>
-          <w:sz w:val="20"/>
-          <w:color w:val="000000"/>
-        </w:rPr>
-        <w:t xml:space="preserve">            !Arrays.asList(movie.genres().split("\|"))</w:t>
-      </w:r>
-    </w:p>
-    <w:p xmlns:w="http://schemas.openxmlformats.org/wordprocessingml/2006/main" xmlns:wpc="http://schemas.microsoft.com/office/word/2010/wordprocessingCanvas" xmlns:mo="http://schemas.microsoft.com/office/mac/office/2008/main" xmlns:mc="http://schemas.openxmlformats.org/markup-compatibility/2006" xmlns:mv="urn:schemas-microsoft-com:mac:vml" xmlns:o="urn:schemas-microsoft-com:office:office" xmlns:r="http://schemas.openxmlformats.org/officeDocument/2006/relationships" xmlns:m="http://schemas.openxmlformats.org/officeDocument/2006/math" xmlns:v="urn:schemas-microsoft-com:vml" xmlns:wp14="http://schemas.microsoft.com/office/word/2010/wordprocessingDrawing" xmlns:wp="http://schemas.openxmlformats.org/drawingml/2006/wordprocessingDrawing" xmlns:w10="urn:schemas-microsoft-com:office:word" xmlns:w14="http://schemas.microsoft.com/office/word/2010/wordml" xmlns:wpg="http://schemas.microsoft.com/office/word/2010/wordprocessingGroup" xmlns:wpi="http://schemas.microsoft.com/office/word/2010/wordprocessingInk" xmlns:wne="http://schemas.microsoft.com/office/word/2006/wordml" xmlns:wps="http://schemas.microsoft.com/office/word/2010/wordprocessingShape">
-      <w:pPr>
-        <w:keepLines/>
-        <w:spacing w:after="0" w:line="230" w:lineRule="exact"/>
-      </w:pPr>
-      <w:r>
-        <w:rPr>
-          <w:rFonts w:ascii="Consolas" w:hAnsi="Consolas"/>
-          <w:sz w:val="20"/>
-          <w:color w:val="000000"/>
-        </w:rPr>
-        <w:t xml:space="preserve">                .contains(genre)) continue;</w:t>
-      </w:r>
-    </w:p>
-    <w:p xmlns:w="http://schemas.openxmlformats.org/wordprocessingml/2006/main" xmlns:wpc="http://schemas.microsoft.com/office/word/2010/wordprocessingCanvas" xmlns:mo="http://schemas.microsoft.com/office/mac/office/2008/main" xmlns:mc="http://schemas.openxmlformats.org/markup-compatibility/2006" xmlns:mv="urn:schemas-microsoft-com:mac:vml" xmlns:o="urn:schemas-microsoft-com:office:office" xmlns:r="http://schemas.openxmlformats.org/officeDocument/2006/relationships" xmlns:m="http://schemas.openxmlformats.org/officeDocument/2006/math" xmlns:v="urn:schemas-microsoft-com:vml" xmlns:wp14="http://schemas.microsoft.com/office/word/2010/wordprocessingDrawing" xmlns:wp="http://schemas.openxmlformats.org/drawingml/2006/wordprocessingDrawing" xmlns:w10="urn:schemas-microsoft-com:office:word" xmlns:w14="http://schemas.microsoft.com/office/word/2010/wordml" xmlns:wpg="http://schemas.microsoft.com/office/word/2010/wordprocessingGroup" xmlns:wpi="http://schemas.microsoft.com/office/word/2010/wordprocessingInk" xmlns:wne="http://schemas.microsoft.com/office/word/2006/wordml" xmlns:wps="http://schemas.microsoft.com/office/word/2010/wordprocessingShape">
-      <w:pPr>
-        <w:keepLines/>
-        <w:spacing w:after="0" w:line="230" w:lineRule="exact"/>
-      </w:pPr>
-      <w:r>
-        <w:rPr>
-          <w:rFonts w:ascii="Consolas" w:hAnsi="Consolas"/>
-          <w:sz w:val="20"/>
-          <w:color w:val="000000"/>
-        </w:rPr>
-        <w:t xml:space="preserve">    double[] item = model.items.get(movie.movieId());</w:t>
-      </w:r>
-    </w:p>
-    <w:p xmlns:w="http://schemas.openxmlformats.org/wordprocessingml/2006/main" xmlns:wpc="http://schemas.microsoft.com/office/word/2010/wordprocessingCanvas" xmlns:mo="http://schemas.microsoft.com/office/mac/office/2008/main" xmlns:mc="http://schemas.openxmlformats.org/markup-compatibility/2006" xmlns:mv="urn:schemas-microsoft-com:mac:vml" xmlns:o="urn:schemas-microsoft-com:office:office" xmlns:r="http://schemas.openxmlformats.org/officeDocument/2006/relationships" xmlns:m="http://schemas.openxmlformats.org/officeDocument/2006/math" xmlns:v="urn:schemas-microsoft-com:vml" xmlns:wp14="http://schemas.microsoft.com/office/word/2010/wordprocessingDrawing" xmlns:wp="http://schemas.openxmlformats.org/drawingml/2006/wordprocessingDrawing" xmlns:w10="urn:schemas-microsoft-com:office:word" xmlns:w14="http://schemas.microsoft.com/office/word/2010/wordml" xmlns:wpg="http://schemas.microsoft.com/office/word/2010/wordprocessingGroup" xmlns:wpi="http://schemas.microsoft.com/office/word/2010/wordprocessingInk" xmlns:wne="http://schemas.microsoft.com/office/word/2006/wordml" xmlns:wps="http://schemas.microsoft.com/office/word/2010/wordprocessingShape">
-      <w:pPr>
-        <w:keepLines/>
-        <w:spacing w:after="0" w:line="230" w:lineRule="exact"/>
-      </w:pPr>
-      <w:r>
-        <w:rPr>
-          <w:rFonts w:ascii="Consolas" w:hAnsi="Consolas"/>
-          <w:sz w:val="20"/>
-          <w:color w:val="000000"/>
-        </w:rPr>
-        <w:t xml:space="preserve">    if (vector != null &amp;&amp; item == null) continue;</w:t>
-      </w:r>
-    </w:p>
-    <w:p xmlns:w="http://schemas.openxmlformats.org/wordprocessingml/2006/main" xmlns:wpc="http://schemas.microsoft.com/office/word/2010/wordprocessingCanvas" xmlns:mo="http://schemas.microsoft.com/office/mac/office/2008/main" xmlns:mc="http://schemas.openxmlformats.org/markup-compatibility/2006" xmlns:mv="urn:schemas-microsoft-com:mac:vml" xmlns:o="urn:schemas-microsoft-com:office:office" xmlns:r="http://schemas.openxmlformats.org/officeDocument/2006/relationships" xmlns:m="http://schemas.openxmlformats.org/officeDocument/2006/math" xmlns:v="urn:schemas-microsoft-com:vml" xmlns:wp14="http://schemas.microsoft.com/office/word/2010/wordprocessingDrawing" xmlns:wp="http://schemas.openxmlformats.org/drawingml/2006/wordprocessingDrawing" xmlns:w10="urn:schemas-microsoft-com:office:word" xmlns:w14="http://schemas.microsoft.com/office/word/2010/wordml" xmlns:wpg="http://schemas.microsoft.com/office/word/2010/wordprocessingGroup" xmlns:wpi="http://schemas.microsoft.com/office/word/2010/wordprocessingInk" xmlns:wne="http://schemas.microsoft.com/office/word/2006/wordml" xmlns:wps="http://schemas.microsoft.com/office/word/2010/wordprocessingShape">
-      <w:pPr>
-        <w:keepLines/>
-        <w:spacing w:after="0" w:line="230" w:lineRule="exact"/>
-      </w:pPr>
-      <w:r>
-        <w:rPr>
-          <w:rFonts w:ascii="Consolas" w:hAnsi="Consolas"/>
-          <w:sz w:val="20"/>
-          <w:color w:val="000000"/>
-        </w:rPr>
-        <w:t xml:space="preserve">    double score = vector == null</w:t>
-      </w:r>
-    </w:p>
-    <w:p xmlns:w="http://schemas.openxmlformats.org/wordprocessingml/2006/main" xmlns:wpc="http://schemas.microsoft.com/office/word/2010/wordprocessingCanvas" xmlns:mo="http://schemas.microsoft.com/office/mac/office/2008/main" xmlns:mc="http://schemas.openxmlformats.org/markup-compatibility/2006" xmlns:mv="urn:schemas-microsoft-com:mac:vml" xmlns:o="urn:schemas-microsoft-com:office:office" xmlns:r="http://schemas.openxmlformats.org/officeDocument/2006/relationships" xmlns:m="http://schemas.openxmlformats.org/officeDocument/2006/math" xmlns:v="urn:schemas-microsoft-com:vml" xmlns:wp14="http://schemas.microsoft.com/office/word/2010/wordprocessingDrawing" xmlns:wp="http://schemas.openxmlformats.org/drawingml/2006/wordprocessingDrawing" xmlns:w10="urn:schemas-microsoft-com:office:word" xmlns:w14="http://schemas.microsoft.com/office/word/2010/wordml" xmlns:wpg="http://schemas.microsoft.com/office/word/2010/wordprocessingGroup" xmlns:wpi="http://schemas.microsoft.com/office/word/2010/wordprocessingInk" xmlns:wne="http://schemas.microsoft.com/office/word/2006/wordml" xmlns:wps="http://schemas.microsoft.com/office/word/2010/wordprocessingShape">
-      <w:pPr>
-        <w:keepLines/>
-        <w:spacing w:after="0" w:line="230" w:lineRule="exact"/>
-      </w:pPr>
-      <w:r>
-        <w:rPr>
-          <w:rFonts w:ascii="Consolas" w:hAnsi="Consolas"/>
-          <w:sz w:val="20"/>
-          <w:color w:val="000000"/>
-        </w:rPr>
-        <w:t xml:space="preserve">        ? movie.weightedRating() : dot(vector, item);</w:t>
-      </w:r>
-    </w:p>
-    <w:p xmlns:w="http://schemas.openxmlformats.org/wordprocessingml/2006/main" xmlns:wpc="http://schemas.microsoft.com/office/word/2010/wordprocessingCanvas" xmlns:mo="http://schemas.microsoft.com/office/mac/office/2008/main" xmlns:mc="http://schemas.openxmlformats.org/markup-compatibility/2006" xmlns:mv="urn:schemas-microsoft-com:mac:vml" xmlns:o="urn:schemas-microsoft-com:office:office" xmlns:r="http://schemas.openxmlformats.org/officeDocument/2006/relationships" xmlns:m="http://schemas.openxmlformats.org/officeDocument/2006/math" xmlns:v="urn:schemas-microsoft-com:vml" xmlns:wp14="http://schemas.microsoft.com/office/word/2010/wordprocessingDrawing" xmlns:wp="http://schemas.openxmlformats.org/drawingml/2006/wordprocessingDrawing" xmlns:w10="urn:schemas-microsoft-com:office:word" xmlns:w14="http://schemas.microsoft.com/office/word/2010/wordml" xmlns:wpg="http://schemas.microsoft.com/office/word/2010/wordprocessingGroup" xmlns:wpi="http://schemas.microsoft.com/office/word/2010/wordprocessingInk" xmlns:wne="http://schemas.microsoft.com/office/word/2006/wordml" xmlns:wps="http://schemas.microsoft.com/office/word/2010/wordprocessingShape">
-      <w:pPr>
-        <w:keepLines/>
-        <w:spacing w:after="0" w:line="230" w:lineRule="exact"/>
-      </w:pPr>
-      <w:r>
-        <w:rPr>
-          <w:rFonts w:ascii="Consolas" w:hAnsi="Consolas"/>
-          <w:sz w:val="20"/>
-          <w:color w:val="000000"/>
-        </w:rPr>
-        <w:t xml:space="preserve">    if (Double.isFinite(score))</w:t>
-      </w:r>
-    </w:p>
-    <w:p xmlns:w="http://schemas.openxmlformats.org/wordprocessingml/2006/main" xmlns:wpc="http://schemas.microsoft.com/office/word/2010/wordprocessingCanvas" xmlns:mo="http://schemas.microsoft.com/office/mac/office/2008/main" xmlns:mc="http://schemas.openxmlformats.org/markup-compatibility/2006" xmlns:mv="urn:schemas-microsoft-com:mac:vml" xmlns:o="urn:schemas-microsoft-com:office:office" xmlns:r="http://schemas.openxmlformats.org/officeDocument/2006/relationships" xmlns:m="http://schemas.openxmlformats.org/officeDocument/2006/math" xmlns:v="urn:schemas-microsoft-com:vml" xmlns:wp14="http://schemas.microsoft.com/office/word/2010/wordprocessingDrawing" xmlns:wp="http://schemas.openxmlformats.org/drawingml/2006/wordprocessingDrawing" xmlns:w10="urn:schemas-microsoft-com:office:word" xmlns:w14="http://schemas.microsoft.com/office/word/2010/wordml" xmlns:wpg="http://schemas.microsoft.com/office/word/2010/wordprocessingGroup" xmlns:wpi="http://schemas.microsoft.com/office/word/2010/wordprocessingInk" xmlns:wne="http://schemas.microsoft.com/office/word/2006/wordml" xmlns:wps="http://schemas.microsoft.com/office/word/2010/wordprocessingShape">
-      <w:pPr>
-        <w:keepLines/>
-        <w:spacing w:after="0" w:line="230" w:lineRule="exact"/>
-      </w:pPr>
-      <w:r>
-        <w:rPr>
-          <w:rFonts w:ascii="Consolas" w:hAnsi="Consolas"/>
-          <w:sz w:val="20"/>
-          <w:color w:val="000000"/>
-        </w:rPr>
-        <w:t xml:space="preserve">        result.add(new Recommendation(movie.movieId(),</w:t>
-      </w:r>
-    </w:p>
-    <w:p xmlns:w="http://schemas.openxmlformats.org/wordprocessingml/2006/main" xmlns:wpc="http://schemas.microsoft.com/office/word/2010/wordprocessingCanvas" xmlns:mo="http://schemas.microsoft.com/office/mac/office/2008/main" xmlns:mc="http://schemas.openxmlformats.org/markup-compatibility/2006" xmlns:mv="urn:schemas-microsoft-com:mac:vml" xmlns:o="urn:schemas-microsoft-com:office:office" xmlns:r="http://schemas.openxmlformats.org/officeDocument/2006/relationships" xmlns:m="http://schemas.openxmlformats.org/officeDocument/2006/math" xmlns:v="urn:schemas-microsoft-com:vml" xmlns:wp14="http://schemas.microsoft.com/office/word/2010/wordprocessingDrawing" xmlns:wp="http://schemas.openxmlformats.org/drawingml/2006/wordprocessingDrawing" xmlns:w10="urn:schemas-microsoft-com:office:word" xmlns:w14="http://schemas.microsoft.com/office/word/2010/wordml" xmlns:wpg="http://schemas.microsoft.com/office/word/2010/wordprocessingGroup" xmlns:wpi="http://schemas.microsoft.com/office/word/2010/wordprocessingInk" xmlns:wne="http://schemas.microsoft.com/office/word/2006/wordml" xmlns:wps="http://schemas.microsoft.com/office/word/2010/wordprocessingShape">
-      <w:pPr>
-        <w:keepLines/>
-        <w:spacing w:after="0" w:line="230" w:lineRule="exact"/>
-      </w:pPr>
-      <w:r>
-        <w:rPr>
-          <w:rFonts w:ascii="Consolas" w:hAnsi="Consolas"/>
-          <w:sz w:val="20"/>
-          <w:color w:val="000000"/>
-        </w:rPr>
-        <w:t xml:space="preserve">            movie.title(), movie.genres(), movie.ratingCount(),</w:t>
-      </w:r>
-    </w:p>
-    <w:p xmlns:w="http://schemas.openxmlformats.org/wordprocessingml/2006/main" xmlns:wpc="http://schemas.microsoft.com/office/word/2010/wordprocessingCanvas" xmlns:mo="http://schemas.microsoft.com/office/mac/office/2008/main" xmlns:mc="http://schemas.openxmlformats.org/markup-compatibility/2006" xmlns:mv="urn:schemas-microsoft-com:mac:vml" xmlns:o="urn:schemas-microsoft-com:office:office" xmlns:r="http://schemas.openxmlformats.org/officeDocument/2006/relationships" xmlns:m="http://schemas.openxmlformats.org/officeDocument/2006/math" xmlns:v="urn:schemas-microsoft-com:vml" xmlns:wp14="http://schemas.microsoft.com/office/word/2010/wordprocessingDrawing" xmlns:wp="http://schemas.openxmlformats.org/drawingml/2006/wordprocessingDrawing" xmlns:w10="urn:schemas-microsoft-com:office:word" xmlns:w14="http://schemas.microsoft.com/office/word/2010/wordml" xmlns:wpg="http://schemas.microsoft.com/office/word/2010/wordprocessingGroup" xmlns:wpi="http://schemas.microsoft.com/office/word/2010/wordprocessingInk" xmlns:wne="http://schemas.microsoft.com/office/word/2006/wordml" xmlns:wps="http://schemas.microsoft.com/office/word/2010/wordprocessingShape">
-      <w:pPr>
-        <w:keepLines/>
-        <w:spacing w:after="0" w:line="230" w:lineRule="exact"/>
-      </w:pPr>
-      <w:r>
-        <w:rPr>
-          <w:rFonts w:ascii="Consolas" w:hAnsi="Consolas"/>
-          <w:sz w:val="20"/>
-          <w:color w:val="000000"/>
-        </w:rPr>
-        <w:t xml:space="preserve">            movie.averageRating(), score));</w:t>
-      </w:r>
-    </w:p>
-    <w:p xmlns:w="http://schemas.openxmlformats.org/wordprocessingml/2006/main" xmlns:wpc="http://schemas.microsoft.com/office/word/2010/wordprocessingCanvas" xmlns:mo="http://schemas.microsoft.com/office/mac/office/2008/main" xmlns:mc="http://schemas.openxmlformats.org/markup-compatibility/2006" xmlns:mv="urn:schemas-microsoft-com:mac:vml" xmlns:o="urn:schemas-microsoft-com:office:office" xmlns:r="http://schemas.openxmlformats.org/officeDocument/2006/relationships" xmlns:m="http://schemas.openxmlformats.org/officeDocument/2006/math" xmlns:v="urn:schemas-microsoft-com:vml" xmlns:wp14="http://schemas.microsoft.com/office/word/2010/wordprocessingDrawing" xmlns:wp="http://schemas.openxmlformats.org/drawingml/2006/wordprocessingDrawing" xmlns:w10="urn:schemas-microsoft-com:office:word" xmlns:w14="http://schemas.microsoft.com/office/word/2010/wordml" xmlns:wpg="http://schemas.microsoft.com/office/word/2010/wordprocessingGroup" xmlns:wpi="http://schemas.microsoft.com/office/word/2010/wordprocessingInk" xmlns:wne="http://schemas.microsoft.com/office/word/2006/wordml" xmlns:wps="http://schemas.microsoft.com/office/word/2010/wordprocessingShape">
-      <w:pPr>
-        <w:keepLines/>
-        <w:spacing w:after="0" w:line="230" w:lineRule="exact"/>
-      </w:pPr>
-      <w:r>
-        <w:rPr>
-          <w:rFonts w:ascii="Consolas" w:hAnsi="Consolas"/>
-          <w:sz w:val="20"/>
-          <w:color w:val="000000"/>
-        </w:rPr>
         <w:t>}</w:t>
-      </w:r>
-    </w:p>
-    <w:p xmlns:w="http://schemas.openxmlformats.org/wordprocessingml/2006/main" xmlns:wpc="http://schemas.microsoft.com/office/word/2010/wordprocessingCanvas" xmlns:mo="http://schemas.microsoft.com/office/mac/office/2008/main" xmlns:mc="http://schemas.openxmlformats.org/markup-compatibility/2006" xmlns:mv="urn:schemas-microsoft-com:mac:vml" xmlns:o="urn:schemas-microsoft-com:office:office" xmlns:r="http://schemas.openxmlformats.org/officeDocument/2006/relationships" xmlns:m="http://schemas.openxmlformats.org/officeDocument/2006/math" xmlns:v="urn:schemas-microsoft-com:vml" xmlns:wp14="http://schemas.microsoft.com/office/word/2010/wordprocessingDrawing" xmlns:wp="http://schemas.openxmlformats.org/drawingml/2006/wordprocessingDrawing" xmlns:w10="urn:schemas-microsoft-com:office:word" xmlns:w14="http://schemas.microsoft.com/office/word/2010/wordml" xmlns:wpg="http://schemas.microsoft.com/office/word/2010/wordprocessingGroup" xmlns:wpi="http://schemas.microsoft.com/office/word/2010/wordprocessingInk" xmlns:wne="http://schemas.microsoft.com/office/word/2006/wordml" xmlns:wps="http://schemas.microsoft.com/office/word/2010/wordprocessingShape">
-      <w:pPr>
-        <w:spacing w:after="100"/>
-        <w:keepLines/>
-        <w:numPr>
-          <w:ilvl w:val="0"/>
-          <w:numId w:val="1"/>
-        </w:numPr>
-        <w:ind w:left="317" w:hanging="173"/>
-      </w:pPr>
-      <w:r>
-        <w:rPr>
-          <w:rFonts w:ascii="Times New Roman" w:hAnsi="Times New Roman"/>
-          <w:b w:val="0"/>
-          <w:sz w:val="28"/>
-          <w:color w:val="000000"/>
-        </w:rPr>
-        <w:t>The first checks remove rated movies and candidates that fail the selected filters.</w:t>
-      </w:r>
-    </w:p>
-    <w:p xmlns:w="http://schemas.openxmlformats.org/wordprocessingml/2006/main" xmlns:wpc="http://schemas.microsoft.com/office/word/2010/wordprocessingCanvas" xmlns:mo="http://schemas.microsoft.com/office/mac/office/2008/main" xmlns:mc="http://schemas.openxmlformats.org/markup-compatibility/2006" xmlns:mv="urn:schemas-microsoft-com:mac:vml" xmlns:o="urn:schemas-microsoft-com:office:office" xmlns:r="http://schemas.openxmlformats.org/officeDocument/2006/relationships" xmlns:m="http://schemas.openxmlformats.org/officeDocument/2006/math" xmlns:v="urn:schemas-microsoft-com:vml" xmlns:wp14="http://schemas.microsoft.com/office/word/2010/wordprocessingDrawing" xmlns:wp="http://schemas.openxmlformats.org/drawingml/2006/wordprocessingDrawing" xmlns:w10="urn:schemas-microsoft-com:office:word" xmlns:w14="http://schemas.microsoft.com/office/word/2010/wordml" xmlns:wpg="http://schemas.microsoft.com/office/word/2010/wordprocessingGroup" xmlns:wpi="http://schemas.microsoft.com/office/word/2010/wordprocessingInk" xmlns:wne="http://schemas.microsoft.com/office/word/2006/wordml" xmlns:wps="http://schemas.microsoft.com/office/word/2010/wordprocessingShape">
-      <w:pPr>
-        <w:spacing w:after="100"/>
-        <w:keepLines/>
-        <w:numPr>
-          <w:ilvl w:val="0"/>
-          <w:numId w:val="1"/>
-        </w:numPr>
-        <w:ind w:left="317" w:hanging="173"/>
-      </w:pPr>
-      <w:r>
-        <w:rPr>
-          <w:rFonts w:ascii="Times New Roman" w:hAnsi="Times New Roman"/>
-          <w:b w:val="0"/>
-          <w:sz w:val="28"/>
-          <w:color w:val="000000"/>
-        </w:rPr>
-        <w:t>Known users receive a factor dot-product score. An unknown user receives the weighted popularity score.</w:t>
-      </w:r>
-    </w:p>
-    <w:p xmlns:w="http://schemas.openxmlformats.org/wordprocessingml/2006/main" xmlns:wpc="http://schemas.microsoft.com/office/word/2010/wordprocessingCanvas" xmlns:mo="http://schemas.microsoft.com/office/mac/office/2008/main" xmlns:mc="http://schemas.openxmlformats.org/markup-compatibility/2006" xmlns:mv="urn:schemas-microsoft-com:mac:vml" xmlns:o="urn:schemas-microsoft-com:office:office" xmlns:r="http://schemas.openxmlformats.org/officeDocument/2006/relationships" xmlns:m="http://schemas.openxmlformats.org/officeDocument/2006/math" xmlns:v="urn:schemas-microsoft-com:vml" xmlns:wp14="http://schemas.microsoft.com/office/word/2010/wordprocessingDrawing" xmlns:wp="http://schemas.openxmlformats.org/drawingml/2006/wordprocessingDrawing" xmlns:w10="urn:schemas-microsoft-com:office:word" xmlns:w14="http://schemas.microsoft.com/office/word/2010/wordml" xmlns:wpg="http://schemas.microsoft.com/office/word/2010/wordprocessingGroup" xmlns:wpi="http://schemas.microsoft.com/office/word/2010/wordprocessingInk" xmlns:wne="http://schemas.microsoft.com/office/word/2006/wordml" xmlns:wps="http://schemas.microsoft.com/office/word/2010/wordprocessingShape">
-      <w:pPr>
-        <w:spacing w:after="100"/>
-        <w:keepLines/>
-        <w:numPr>
-          <w:ilvl w:val="0"/>
-          <w:numId w:val="1"/>
-        </w:numPr>
-        <w:ind w:left="317" w:hanging="173"/>
-      </w:pPr>
-      <w:r>
-        <w:rPr>
-          <w:rFonts w:ascii="Times New Roman" w:hAnsi="Times New Roman"/>
-          <w:b w:val="0"/>
-          <w:sz w:val="28"/>
-          <w:color w:val="000000"/>
-        </w:rPr>
-        <w:t>Results are sorted by descending score. Rating count, title and movie ID provide a consistent order when scores tie.</w:t>
       </w:r>
     </w:p>
     <w:p xmlns:w="http://schemas.openxmlformats.org/wordprocessingml/2006/main" xmlns:wpc="http://schemas.microsoft.com/office/word/2010/wordprocessingCanvas" xmlns:mo="http://schemas.microsoft.com/office/mac/office/2008/main" xmlns:mc="http://schemas.openxmlformats.org/markup-compatibility/2006" xmlns:mv="urn:schemas-microsoft-com:mac:vml" xmlns:o="urn:schemas-microsoft-com:office:office" xmlns:r="http://schemas.openxmlformats.org/officeDocument/2006/relationships" xmlns:m="http://schemas.openxmlformats.org/officeDocument/2006/math" xmlns:v="urn:schemas-microsoft-com:vml" xmlns:wp14="http://schemas.microsoft.com/office/word/2010/wordprocessingDrawing" xmlns:wp="http://schemas.openxmlformats.org/drawingml/2006/wordprocessingDrawing" xmlns:w10="urn:schemas-microsoft-com:office:word" xmlns:w14="http://schemas.microsoft.com/office/word/2010/wordml" xmlns:wpg="http://schemas.microsoft.com/office/word/2010/wordprocessingGroup" xmlns:wpi="http://schemas.microsoft.com/office/word/2010/wordprocessingInk" xmlns:wne="http://schemas.microsoft.com/office/word/2006/wordml" xmlns:wps="http://schemas.microsoft.com/office/word/2010/wordprocessingShape">

</xml_diff>